<commit_message>
Reframe the CV opening for academic applications
- Rewrite the summary around the research agenda: multi-agent systems,
  game theory, human-AI collaboration, human behavior prediction, and
  LLM-based text understanding
- Remove the Core Skills line and the two tech-stack lines
- Sharpen the Research Interests list
- Regenerate the PDF (six pages, Carlito)
- Add the College of Management to the website's teaching card

Co-Authored-By: Claude Fable 5.1 <noreply@anthropic.com>
Claude-Session: https://claude.ai/code/session_01P2fsSpp5LJyrgm7ofHkpMm
</commit_message>
<xml_diff>
--- a/cv/Moshe_Mash_CV.docx
+++ b/cv/Moshe_Mash_CV.docx
@@ -82,7 +82,105 @@
         </w:numPr>
       </w:pPr>
       <w:r>
-        <w:t>AI researcher specializing in natural language processing and document understanding - extracting structure and meaning from large, unstructured text collections. Over the past year at DICTA I have focused on understanding text at scale: information extraction, document classification, citation and cross-reference detection, semantic search, and question-answering over complex documents, using fine-tuned LLMs and retrieval-augmented generation taken through to production. Ph.D. in Software and Information Systems Engineering (Ben-Gurion University); postdoctoral fellow at Carnegie Mellon's Robotics Institute. Over a decade translating research into production - built predictive systems at Amdocs saving millions annually, deployed clinical ML at Diagnostic Robotics, and now founder of MashInnovateAI. Best Paper Award at ACM EC 2016 and a Communications of the ACM Research Highlight (2018), with publications in JACM, AIJ, CHI, IJCAI, and Science Translational Medicine.</w:t>
+        <w:t>I am an AI researcher working at the intersection of multi-agent systems, game theory, and human-AI collaboration, with a second, applied line of research in natural language processing and large language models. My research asks how self-interested and boundedly rational agents, human and artificial, make decisions and reach agreements, combining game-theoretic and mechanism-design analysis with human-subjects experiments and predictive models of human behavior in mixed human-agent settings. A complementary strand develops LLM-based methods for understanding specialized text corpora, including authorship attribution, citation and cross-reference detection, and textual analysis of legal and patent documents. I hold a Ph.D. in Software and Information Systems Engineering from Ben-Gurion University and was a postdoctoral fellow at Carnegie Mellon University's Robotics Institute. My work received the Best Paper Award at ACM EC 2016 and was selected as a Communications of the ACM Research Highlight (2018), with publications in JACM, AIJ, ACM TIST, CHI, IJCAI, AAMAS, and Science Translational Medicine. I am currently an AI Researcher at DICTA – The Israel Center for Text Analysis and the founder of MashInnovateAI.</w:t>
+      </w:r>
+    </w:p>
+    <w:p>
+      <w:r>
+        <w:rPr>
+          <w:rFonts w:ascii="Calibri" w:eastAsia="Calibri" w:hAnsi="Calibri"/>
+        </w:rPr>
+        <w:pict w14:anchorId="050FCB5C">
+          <v:rect id="_x0000_i1028" style="width:0;height:1.5pt" o:hralign="center" o:hrstd="t" o:hrnoshade="t" o:hr="t" fillcolor="gray" stroked="f"/>
+        </w:pict>
+      </w:r>
+    </w:p>
+    <w:p>
+      <w:pPr>
+        <w:rPr>
+          <w:b/>
+          <w:bCs/>
+        </w:rPr>
+      </w:pPr>
+      <w:r>
+        <w:rPr>
+          <w:rFonts w:ascii="Calibri" w:eastAsia="Calibri" w:hAnsi="Calibri"/>
+          <w:b/>
+          <w:bCs/>
+        </w:rPr>
+        <w:t>Research Interests</w:t>
+      </w:r>
+    </w:p>
+    <w:p>
+      <w:r>
+        <w:rPr>
+          <w:rFonts w:ascii="Calibri" w:eastAsia="Calibri" w:hAnsi="Calibri"/>
+        </w:rPr>
+        <w:t>Multi-Agent Systems; Game Theory and Mechanism Design; Social Choice and Fair Division; Human-AI Collaboration and Mixed Human-Agent Settings; Decision-Making of Self-Interested and Boundedly Rational Agents; Modeling and Prediction of Human Behavior; Natural Language Processing and Large Language Models; Computational Analysis of Specialized Text Corpora (Hebrew and rabbinic texts, legal and patent documents); Human-Centered AI.</w:t>
+      </w:r>
+    </w:p>
+    <w:p>
+      <w:r>
+        <w:rPr>
+          <w:rFonts w:ascii="Calibri" w:eastAsia="Calibri" w:hAnsi="Calibri"/>
+        </w:rPr>
+        <w:pict w14:anchorId="50DDD9F5">
+          <v:rect id="_x0000_i1026" style="width:0;height:1.5pt" o:hralign="center" o:hrstd="t" o:hrnoshade="t" o:hr="t" fillcolor="gray" stroked="f"/>
+        </w:pict>
+      </w:r>
+    </w:p>
+    <w:p>
+      <w:pPr>
+        <w:rPr>
+          <w:b/>
+          <w:bCs/>
+        </w:rPr>
+      </w:pPr>
+      <w:r>
+        <w:rPr>
+          <w:rFonts w:ascii="Calibri" w:eastAsia="Calibri" w:hAnsi="Calibri"/>
+          <w:b/>
+          <w:bCs/>
+        </w:rPr>
+        <w:t>Education</w:t>
+      </w:r>
+    </w:p>
+    <w:p>
+      <w:r>
+        <w:rPr>
+          <w:rFonts w:ascii="Calibri" w:eastAsia="Calibri" w:hAnsi="Calibri"/>
+          <w:b/>
+          <w:bCs/>
+        </w:rPr>
+        <w:t>Ph.D., Software and Information Systems Engineering</w:t>
+      </w:r>
+      <w:r>
+        <w:rPr>
+          <w:rFonts w:ascii="Calibri" w:eastAsia="Calibri" w:hAnsi="Calibri"/>
+        </w:rPr>
+        <w:t xml:space="preserve"> | </w:t>
+      </w:r>
+      <w:r>
+        <w:rPr>
+          <w:rFonts w:ascii="Calibri" w:eastAsia="Calibri" w:hAnsi="Calibri"/>
+          <w:b/>
+          <w:bCs/>
+        </w:rPr>
+        <w:t>Ben-Gurion University of the Negev</w:t>
+      </w:r>
+      <w:r>
+        <w:rPr>
+          <w:rFonts w:ascii="Calibri" w:eastAsia="Calibri" w:hAnsi="Calibri"/>
+        </w:rPr>
+        <w:t xml:space="preserve"> | </w:t>
+      </w:r>
+      <w:r>
+        <w:rPr>
+          <w:rFonts w:ascii="Calibri" w:eastAsia="Calibri" w:hAnsi="Calibri"/>
+          <w:b/>
+          <w:bCs/>
+        </w:rPr>
+        <w:t>2014–2018</w:t>
       </w:r>
     </w:p>
     <w:p>
@@ -94,111 +192,17 @@
       </w:pPr>
       <w:r>
         <w:rPr>
+          <w:rFonts w:ascii="Calibri" w:eastAsia="Calibri" w:hAnsi="Calibri"/>
           <w:b/>
-        </w:rPr>
-        <w:t xml:space="preserve">Core Skills: </w:t>
-      </w:r>
-      <w:r>
-        <w:t>Natural Language Processing (NLP) · Document &amp; Text Understanding · Information Extraction · Document Classification · Semantic Search &amp; Similarity · Question-Answering over Documents · LLM fine-tuning · Retrieval-Augmented Generation (RAG) · Applied AI · Agentic AI · End-to-end delivery (proof of concept → production) · Python · PyTorch · HuggingFace Transformers · Production ML · SQL · Distributed Training · Multi-Agent Systems · Game Theory &amp; Mechanism Design</w:t>
-      </w:r>
-    </w:p>
-    <w:p>
-      <w:r>
-        <w:rPr>
-          <w:rFonts w:ascii="Calibri" w:eastAsia="Calibri" w:hAnsi="Calibri"/>
-        </w:rPr>
-        <w:pict w14:anchorId="050FCB5C">
-          <v:rect id="_x0000_i1028" style="width:0;height:1.5pt" o:hralign="center" o:hrstd="t" o:hrnoshade="t" o:hr="t" fillcolor="gray" stroked="f"/>
-        </w:pict>
-      </w:r>
-    </w:p>
-    <w:p>
-      <w:pPr>
-        <w:rPr>
-          <w:b/>
-          <w:bCs/>
-        </w:rPr>
-      </w:pPr>
-      <w:r>
-        <w:rPr>
-          <w:rFonts w:ascii="Calibri" w:eastAsia="Calibri" w:hAnsi="Calibri"/>
-          <w:b/>
-          <w:bCs/>
-        </w:rPr>
-        <w:t>Research Interests</w:t>
-      </w:r>
-    </w:p>
-    <w:p>
-      <w:r>
-        <w:rPr>
-          <w:rFonts w:ascii="Calibri" w:eastAsia="Calibri" w:hAnsi="Calibri"/>
-        </w:rPr>
-        <w:lastRenderedPageBreak/>
-        <w:t>Text Understanding, Text Analysis, Natural Language Processing, Multi-Agent Systems, Human-Agent Environments, Decision-Making, Game Theory and Mechanism Design, Human-AI Interaction, Human-Centric AI, Artificial Intelligence, Machine Learning, Data Science Workflows.</w:t>
-      </w:r>
-    </w:p>
-    <w:p>
-      <w:r>
-        <w:rPr>
-          <w:rFonts w:ascii="Calibri" w:eastAsia="Calibri" w:hAnsi="Calibri"/>
-        </w:rPr>
-        <w:pict w14:anchorId="50DDD9F5">
-          <v:rect id="_x0000_i1026" style="width:0;height:1.5pt" o:hralign="center" o:hrstd="t" o:hrnoshade="t" o:hr="t" fillcolor="gray" stroked="f"/>
-        </w:pict>
-      </w:r>
-    </w:p>
-    <w:p>
-      <w:pPr>
-        <w:rPr>
-          <w:b/>
-          <w:bCs/>
-        </w:rPr>
-      </w:pPr>
-      <w:r>
-        <w:rPr>
-          <w:rFonts w:ascii="Calibri" w:eastAsia="Calibri" w:hAnsi="Calibri"/>
-          <w:b/>
-          <w:bCs/>
-        </w:rPr>
-        <w:t>Education</w:t>
-      </w:r>
-    </w:p>
-    <w:p>
-      <w:r>
-        <w:rPr>
-          <w:rFonts w:ascii="Calibri" w:eastAsia="Calibri" w:hAnsi="Calibri"/>
-          <w:b/>
-          <w:bCs/>
-        </w:rPr>
-        <w:t>Ph.D., Software and Information Systems Engineering</w:t>
-      </w:r>
-      <w:r>
-        <w:rPr>
-          <w:rFonts w:ascii="Calibri" w:eastAsia="Calibri" w:hAnsi="Calibri"/>
-        </w:rPr>
-        <w:t xml:space="preserve"> | </w:t>
-      </w:r>
-      <w:r>
-        <w:rPr>
-          <w:rFonts w:ascii="Calibri" w:eastAsia="Calibri" w:hAnsi="Calibri"/>
-          <w:b/>
-          <w:bCs/>
-        </w:rPr>
-        <w:t>Ben-Gurion University of the Negev</w:t>
-      </w:r>
-      <w:r>
-        <w:rPr>
-          <w:rFonts w:ascii="Calibri" w:eastAsia="Calibri" w:hAnsi="Calibri"/>
-        </w:rPr>
-        <w:t xml:space="preserve"> | </w:t>
-      </w:r>
-      <w:r>
-        <w:rPr>
-          <w:rFonts w:ascii="Calibri" w:eastAsia="Calibri" w:hAnsi="Calibri"/>
-          <w:b/>
-          <w:bCs/>
-        </w:rPr>
-        <w:t>2014–2018</w:t>
+          <w:bCs/>
+        </w:rPr>
+        <w:t>Dissertation:</w:t>
+      </w:r>
+      <w:r>
+        <w:rPr>
+          <w:rFonts w:ascii="Calibri" w:eastAsia="Calibri" w:hAnsi="Calibri"/>
+        </w:rPr>
+        <w:t xml:space="preserve"> Reaching Fair Agreements in Group Settings</w:t>
       </w:r>
     </w:p>
     <w:p>
@@ -214,28 +218,6 @@
           <w:b/>
           <w:bCs/>
         </w:rPr>
-        <w:t>Dissertation:</w:t>
-      </w:r>
-      <w:r>
-        <w:rPr>
-          <w:rFonts w:ascii="Calibri" w:eastAsia="Calibri" w:hAnsi="Calibri"/>
-        </w:rPr>
-        <w:t xml:space="preserve"> Reaching Fair Agreements in Group Settings</w:t>
-      </w:r>
-    </w:p>
-    <w:p>
-      <w:pPr>
-        <w:numPr>
-          <w:ilvl w:val="0"/>
-          <w:numId w:val="19"/>
-        </w:numPr>
-      </w:pPr>
-      <w:r>
-        <w:rPr>
-          <w:rFonts w:ascii="Calibri" w:eastAsia="Calibri" w:hAnsi="Calibri"/>
-          <w:b/>
-          <w:bCs/>
-        </w:rPr>
         <w:t>Advisor:</w:t>
       </w:r>
       <w:r>
@@ -972,17 +954,6 @@
       </w:r>
     </w:p>
     <w:p>
-      <w:pPr>
-        <w:numPr>
-          <w:ilvl w:val="0"/>
-          <w:numId w:val="21"/>
-        </w:numPr>
-      </w:pPr>
-      <w:r>
-        <w:t>Tech stack: Python, scikit-learn, and clinical/EHR data pipelines.</w:t>
-      </w:r>
-    </w:p>
-    <w:p>
       <w:r>
         <w:rPr>
           <w:rFonts w:ascii="Calibri" w:eastAsia="Calibri" w:hAnsi="Calibri"/>
@@ -1046,17 +1017,6 @@
           <w:rFonts w:ascii="Calibri" w:eastAsia="Calibri" w:hAnsi="Calibri"/>
         </w:rPr>
         <w:t>Designed, built, and deployed the system from scratch, including problem definition, algorithm design, evaluation, and deployment pipeline.</w:t>
-      </w:r>
-    </w:p>
-    <w:p>
-      <w:pPr>
-        <w:numPr>
-          <w:ilvl w:val="0"/>
-          <w:numId w:val="21"/>
-        </w:numPr>
-      </w:pPr>
-      <w:r>
-        <w:t>Tech stack: Python, scikit-learn, SQL, and a production deployment pipeline.</w:t>
       </w:r>
     </w:p>
     <w:p>

</xml_diff>

<commit_message>
Frame the research around artificial agents and humans; add workflow analysis
Co-Authored-By: Claude Fable 5.1 <noreply@anthropic.com>
Claude-Session: https://claude.ai/code/session_01P2fsSpp5LJyrgm7ofHkpMm
</commit_message>
<xml_diff>
--- a/cv/Moshe_Mash_CV.docx
+++ b/cv/Moshe_Mash_CV.docx
@@ -82,7 +82,7 @@
         </w:numPr>
       </w:pPr>
       <w:r>
-        <w:t>I am an AI researcher working at the intersection of multi-agent systems, game theory, and human-AI collaboration, with a second, applied line of research in natural language processing and large language models. My research asks how self-interested and boundedly rational agents, human and artificial, make decisions and reach agreements, combining game-theoretic and mechanism-design analysis with human-subjects experiments and predictive models of human behavior in mixed human-agent settings. A complementary strand develops LLM-based methods for understanding specialized text corpora, including authorship attribution, citation and cross-reference detection, and textual analysis of legal and patent documents. I hold a Ph.D. in Software and Information Systems Engineering from Ben-Gurion University and was a postdoctoral fellow at Carnegie Mellon University's Robotics Institute. My work received the Best Paper Award at ACM EC 2016 and was selected as a Communications of the ACM Research Highlight (2018), with publications in JACM, AIJ, ACM TIST, CHI, IJCAI, AAMAS, and Science Translational Medicine. I am currently an AI Researcher at DICTA – The Israel Center for Text Analysis and the founder of MashInnovateAI.</w:t>
+        <w:t>I am an AI researcher working at the intersection of multi-agent systems, game theory, and human-AI collaboration, with a second, applied line of research in natural language processing and large language models. My research asks how artificial agents and humans make decisions, cooperate, and reach agreements, both on their own and together, combining game-theoretic and mechanism-design analysis with human-subjects experiments and predictive models of human behavior in mixed human-agent settings. I also study how people build AI systems, capturing and analyzing the workflows of data scientists to predict where they get stuck. A complementary strand develops LLM-based methods for understanding specialized text corpora, including authorship attribution, citation and cross-reference detection, and textual analysis of legal and patent documents. I hold a Ph.D. in Software and Information Systems Engineering from Ben-Gurion University and was a postdoctoral fellow at Carnegie Mellon University's Robotics Institute. My work received the Best Paper Award at ACM EC 2016 and was selected as a Communications of the ACM Research Highlight (2018), with publications in JACM, AIJ, ACM TIST, CHI, IJCAI, AAMAS, and Science Translational Medicine. I am currently an AI Researcher at DICTA – The Israel Center for Text Analysis and the founder of MashInnovateAI.</w:t>
       </w:r>
     </w:p>
     <w:p>
@@ -116,7 +116,7 @@
         <w:rPr>
           <w:rFonts w:ascii="Calibri" w:eastAsia="Calibri" w:hAnsi="Calibri"/>
         </w:rPr>
-        <w:t>Multi-Agent Systems; Game Theory and Mechanism Design; Social Choice and Fair Division; Human-AI Collaboration and Mixed Human-Agent Settings; Decision-Making of Self-Interested and Boundedly Rational Agents; Modeling and Prediction of Human Behavior; Natural Language Processing and Large Language Models; Computational Analysis of Specialized Text Corpora (Hebrew and rabbinic texts, legal and patent documents); Human-Centered AI.</w:t>
+        <w:t>Multi-Agent Systems; Game Theory and Mechanism Design; Social Choice and Fair Division; Human-AI Collaboration and Mixed Human-Agent Settings; Decision-Making by Artificial Agents and Humans; Modeling and Prediction of Human Behavior; Analysis of Data Science and Machine Learning Workflows; Natural Language Processing and Large Language Models; Computational Analysis of Specialized Text Corpora (Hebrew and rabbinic texts, legal and patent documents); Human-Centered AI.</w:t>
       </w:r>
     </w:p>
     <w:p>

</xml_diff>

<commit_message>
Separate DICTA from MashInnovateAI and frame the consultancy around problem-solving
Co-Authored-By: Claude Fable 5.1 <noreply@anthropic.com>
Claude-Session: https://claude.ai/code/session_01P2fsSpp5LJyrgm7ofHkpMm
</commit_message>
<xml_diff>
--- a/cv/Moshe_Mash_CV.docx
+++ b/cv/Moshe_Mash_CV.docx
@@ -82,7 +82,7 @@
         </w:numPr>
       </w:pPr>
       <w:r>
-        <w:t>I am an AI researcher working at the intersection of multi-agent systems, game theory, and human-AI collaboration, with a second, applied line of research in natural language processing and large language models. My research asks how artificial agents and humans make decisions, cooperate, and reach agreements, both on their own and together, combining game-theoretic and mechanism-design analysis with human-subjects experiments and predictive models of human behavior in mixed human-agent settings. I also study how ML practitioners and data scientists build AI systems, capturing and analyzing their workflows to predict where they get stuck. A complementary strand develops LLM-based methods for understanding specialized text corpora, including authorship attribution, citation and cross-reference detection, and textual analysis of legal and patent documents. I hold a Ph.D. in Software and Information Systems Engineering from Ben-Gurion University and was a postdoctoral fellow at Carnegie Mellon University's Robotics Institute. My work received the Best Paper Award at ACM EC 2016 and was selected as a Communications of the ACM Research Highlight (2018), with publications in JACM, AIJ, ACM TIST, CHI, IJCAI, AAMAS, and Science Translational Medicine. I am currently an AI Researcher at DICTA – The Israel Center for Text Analysis and the founder of MashInnovateAI, an independent AI research and development consultancy. Beyond academia, I bring over a decade of hands-on experience taking AI systems from research to deployment, including a predictive system I designed and deployed end to end at Amdocs that remains in operational use, and I have taught at five institutions and mentored students at Ben-Gurion University and Carnegie Mellon.</w:t>
+        <w:t>I am an AI researcher working at the intersection of multi-agent systems, game theory, and human-AI collaboration, with a second, applied line of research in natural language processing and large language models. My research asks how artificial agents and humans make decisions, cooperate, and reach agreements, both on their own and together, combining game-theoretic and mechanism-design analysis with human-subjects experiments and predictive models of human behavior in mixed human-agent settings. I also study how ML practitioners and data scientists build AI systems, capturing and analyzing their workflows to predict where they get stuck. A complementary strand develops LLM-based methods for understanding specialized text corpora, including authorship attribution, citation and cross-reference detection, and textual analysis of legal and patent documents. I hold a Ph.D. in Software and Information Systems Engineering from Ben-Gurion University and was a postdoctoral fellow at Carnegie Mellon University's Robotics Institute. My work received the Best Paper Award at ACM EC 2016 and was selected as a Communications of the ACM Research Highlight (2018), with publications in JACM, AIJ, ACM TIST, CHI, IJCAI, AAMAS, and Science Translational Medicine. I am currently an AI Researcher at DICTA – The Israel Center for Text Analysis. I am also the founder of MashInnovateAI, an independent AI research and development consultancy through which I help technology companies, startups, and research groups identify where AI can solve their hardest problems and deliver the solution end to end. Beyond academia, I bring over a decade of hands-on experience taking AI systems from research to deployment, including a predictive system I designed and deployed end to end at Amdocs that remains in operational use, and I have taught at five institutions and mentored students at Ben-Gurion University and Carnegie Mellon.</w:t>
       </w:r>
     </w:p>
     <w:p>
@@ -745,7 +745,7 @@
         </w:numPr>
       </w:pPr>
       <w:r>
-        <w:t>Independent AI research &amp; development consultancy delivering end-to-end custom AI systems - NLP, LLM fine-tuning, RAG, agentic and multi-agent LLM systems, and applied ML - from proof of concept to production deployment for research and industry partners.</w:t>
+        <w:t>Independent AI research &amp; development consultancy: helps organizations identify where AI can solve their hardest problems, then designs and delivers the solution end to end - applied ML, NLP, LLM fine-tuning, RAG, and agentic and multi-agent systems - from proof of concept to production deployment.</w:t>
       </w:r>
     </w:p>
     <w:p>

</xml_diff>

<commit_message>
Name the Amdocs system as churn prediction; simplify the behavior-prediction theme
Co-Authored-By: Claude Fable 5.1 <noreply@anthropic.com>
Claude-Session: https://claude.ai/code/session_01P2fsSpp5LJyrgm7ofHkpMm
</commit_message>
<xml_diff>
--- a/cv/Moshe_Mash_CV.docx
+++ b/cv/Moshe_Mash_CV.docx
@@ -82,7 +82,7 @@
         </w:numPr>
       </w:pPr>
       <w:r>
-        <w:t>I am an AI researcher working at the intersection of multi-agent systems, game theory, and human-AI collaboration, with a second, applied line of research in natural language processing and large language models. My research asks how artificial agents and humans make decisions, cooperate, and reach agreements, both on their own and together, combining game-theoretic and mechanism-design analysis with human-subjects experiments and predictive models of human behavior in mixed human-agent settings. I also study how ML practitioners and data scientists build AI systems, capturing and analyzing their workflows to predict where they get stuck. A complementary strand develops LLM-based methods for understanding specialized text corpora, including authorship attribution, citation and cross-reference detection, and textual analysis of legal and patent documents. I hold a Ph.D. in Software and Information Systems Engineering from Ben-Gurion University and was a postdoctoral fellow at Carnegie Mellon University's Robotics Institute. My work received the Best Paper Award at ACM EC 2016 and was selected as a Communications of the ACM Research Highlight (2018), with publications in JACM, AIJ, ACM TIST, CHI, IJCAI, AAMAS, ACM EC, and Science Translational Medicine, among other venues, and I serve as a reviewer for AAAI, IJCAI, AAMAS, KDD, CHI, EC, and ECAI. I am currently an AI Researcher at DICTA – The Israel Center for Text Analysis. I am also the founder of MashInnovateAI, an independent AI research and development consultancy through which I help technology companies, startups, and research groups identify where AI can solve their hardest problems and deliver the solution end to end. Beyond academia, I bring over a decade of hands-on experience taking AI systems from research to deployment, including a predictive system I designed and deployed end to end at Amdocs that remains in operational use, and I have taught at five institutions and mentored students at Ben-Gurion University and Carnegie Mellon.</w:t>
+        <w:t>I am an AI researcher working at the intersection of multi-agent systems, game theory, and human-AI collaboration, with a second, applied line of research in natural language processing and large language models. My research asks how artificial agents and humans make decisions, cooperate, and reach agreements, both on their own and together, combining game-theoretic and mechanism-design analysis with human-subjects experiments and predictive models of human behavior in mixed human-agent settings. I also study how ML practitioners and data scientists build AI systems, capturing and analyzing their workflows to predict where they get stuck. A complementary strand develops LLM-based methods for understanding specialized text corpora, including authorship attribution, citation and cross-reference detection, and textual analysis of legal and patent documents. I hold a Ph.D. in Software and Information Systems Engineering from Ben-Gurion University and was a postdoctoral fellow at Carnegie Mellon University's Robotics Institute. My work received the Best Paper Award at ACM EC 2016 and was selected as a Communications of the ACM Research Highlight (2018), with publications in JACM, AIJ, ACM TIST, CHI, IJCAI, AAMAS, ACM EC, and Science Translational Medicine, among other venues, and I serve as a reviewer for AAAI, IJCAI, AAMAS, KDD, CHI, EC, and ECAI. I am currently an AI Researcher at DICTA – The Israel Center for Text Analysis. I am also the founder of MashInnovateAI, an independent AI research and development consultancy through which I help technology companies, startups, and research groups identify where AI can solve their hardest problems and deliver the solution end to end. Beyond academia, I bring over a decade of hands-on experience taking AI systems from research to deployment, including a churn-prediction system I designed and deployed end to end at Amdocs that remains in operational use, and I have taught at five institutions and mentored students at Ben-Gurion University and Carnegie Mellon.</w:t>
       </w:r>
     </w:p>
     <w:p>
@@ -1002,7 +1002,7 @@
         <w:rPr>
           <w:rFonts w:ascii="Calibri" w:eastAsia="Calibri" w:hAnsi="Calibri"/>
         </w:rPr>
-        <w:t>Led the development of an innovative system predicting at-risk maintenance contract renewals, saving the company millions of dollars and still in operational use years later.</w:t>
+        <w:t>Led the development of a churn-prediction system for at-risk maintenance contract renewals, saving the company millions of dollars and still in operational use years later.</w:t>
       </w:r>
     </w:p>
     <w:p>

</xml_diff>

<commit_message>
Format the CV summary as bullet points
Co-Authored-By: Claude Fable 5.1 <noreply@anthropic.com>
Claude-Session: https://claude.ai/code/session_01P2fsSpp5LJyrgm7ofHkpMm
</commit_message>
<xml_diff>
--- a/cv/Moshe_Mash_CV.docx
+++ b/cv/Moshe_Mash_CV.docx
@@ -82,7 +82,51 @@
         </w:numPr>
       </w:pPr>
       <w:r>
-        <w:t>AI researcher working at the intersection of multi-agent systems, game theory, and human-AI collaboration, with an applied line of research in natural language processing and large language models. My work follows three main directions: environments shared by humans and computer agents, and how to design agents that act well alongside people; how ML practitioners and data scientists build AI systems, and where they get stuck; and LLM-based methods for understanding large collections of specialized text. Ph.D. in Software and Information Systems Engineering (Ben-Gurion University); postdoctoral fellow at Carnegie Mellon's Robotics Institute. Best Paper Award at ACM EC 2016 and a Communications of the ACM Research Highlight (2018), with publications in JACM, AIJ, ACM TIST, CHI, IJCAI, and AAMAS. Over a decade of hands-on experience taking AI systems from research to production at Amdocs, Diagnostic Robotics, DICTA, and MashInnovateAI, the AI R&amp;D consultancy I founded.</w:t>
+        <w:t>AI researcher at the intersection of multi-agent systems, game theory, and human-AI collaboration, with an applied line of research in natural language processing and large language models.</w:t>
+      </w:r>
+    </w:p>
+    <w:p>
+      <w:pPr>
+        <w:numPr>
+          <w:ilvl w:val="0"/>
+          <w:numId w:val="19"/>
+        </w:numPr>
+      </w:pPr>
+      <w:r>
+        <w:t>Three main research directions: environments shared by humans and computer agents, and how to design agents that act well alongside people; how ML practitioners and data scientists build AI systems, and where they get stuck; and LLM-based methods for understanding large collections of specialized text.</w:t>
+      </w:r>
+    </w:p>
+    <w:p>
+      <w:pPr>
+        <w:numPr>
+          <w:ilvl w:val="0"/>
+          <w:numId w:val="19"/>
+        </w:numPr>
+      </w:pPr>
+      <w:r>
+        <w:t>Ph.D. in Software and Information Systems Engineering (Ben-Gurion University); postdoctoral fellow at Carnegie Mellon's Robotics Institute.</w:t>
+      </w:r>
+    </w:p>
+    <w:p>
+      <w:pPr>
+        <w:numPr>
+          <w:ilvl w:val="0"/>
+          <w:numId w:val="19"/>
+        </w:numPr>
+      </w:pPr>
+      <w:r>
+        <w:t>Best Paper Award at ACM EC 2016 and a Communications of the ACM Research Highlight (2018); publications in JACM, AIJ, ACM TIST, CHI, IJCAI, and AAMAS.</w:t>
+      </w:r>
+    </w:p>
+    <w:p>
+      <w:pPr>
+        <w:numPr>
+          <w:ilvl w:val="0"/>
+          <w:numId w:val="19"/>
+        </w:numPr>
+      </w:pPr>
+      <w:r>
+        <w:t>Over a decade of hands-on experience taking AI systems from research to production at Amdocs, Diagnostic Robotics, DICTA, and MashInnovateAI, the AI R&amp;D consultancy I founded.</w:t>
       </w:r>
     </w:p>
     <w:p>

</xml_diff>

<commit_message>
Remove the Summary section from the CV
The CV now opens with Research Interests, as academic CVs usually do.

Co-Authored-By: Claude Fable 5.1 <noreply@anthropic.com>
Claude-Session: https://claude.ai/code/session_01P2fsSpp5LJyrgm7ofHkpMm
</commit_message>
<xml_diff>
--- a/cv/Moshe_Mash_CV.docx
+++ b/cv/Moshe_Mash_CV.docx
@@ -57,85 +57,6 @@
         </w:rPr>
         <w:pict w14:anchorId="61673EB7">
           <v:rect id="_x0000_i1025" style="width:0;height:1.5pt" o:hralign="center" o:hrstd="t" o:hrnoshade="t" o:hr="t" fillcolor="gray" stroked="f"/>
-        </w:pict>
-      </w:r>
-    </w:p>
-    <w:p>
-      <w:pPr>
-        <w:rPr>
-          <w:b/>
-          <w:bCs/>
-        </w:rPr>
-      </w:pPr>
-      <w:r>
-        <w:rPr>
-          <w:b/>
-        </w:rPr>
-        <w:t>Summary</w:t>
-      </w:r>
-    </w:p>
-    <w:p>
-      <w:pPr>
-        <w:numPr>
-          <w:ilvl w:val="0"/>
-          <w:numId w:val="19"/>
-        </w:numPr>
-      </w:pPr>
-      <w:r>
-        <w:t>AI researcher at the intersection of multi-agent systems, game theory, and human-AI collaboration, with an applied line of research in natural language processing and large language models.</w:t>
-      </w:r>
-    </w:p>
-    <w:p>
-      <w:pPr>
-        <w:numPr>
-          <w:ilvl w:val="0"/>
-          <w:numId w:val="19"/>
-        </w:numPr>
-      </w:pPr>
-      <w:r>
-        <w:t>Three main research directions: environments shared by humans and computer agents, and how to design agents that act well alongside people; how ML practitioners and data scientists build AI systems, and where they get stuck; and LLM-based methods for understanding large collections of specialized text.</w:t>
-      </w:r>
-    </w:p>
-    <w:p>
-      <w:pPr>
-        <w:numPr>
-          <w:ilvl w:val="0"/>
-          <w:numId w:val="19"/>
-        </w:numPr>
-      </w:pPr>
-      <w:r>
-        <w:t>Ph.D. in Software and Information Systems Engineering (Ben-Gurion University); postdoctoral fellow at Carnegie Mellon's Robotics Institute.</w:t>
-      </w:r>
-    </w:p>
-    <w:p>
-      <w:pPr>
-        <w:numPr>
-          <w:ilvl w:val="0"/>
-          <w:numId w:val="19"/>
-        </w:numPr>
-      </w:pPr>
-      <w:r>
-        <w:t>Best Paper Award at ACM EC 2016 and a Communications of the ACM Research Highlight (2018); publications in JACM, AIJ, ACM TIST, CHI, IJCAI, and AAMAS.</w:t>
-      </w:r>
-    </w:p>
-    <w:p>
-      <w:pPr>
-        <w:numPr>
-          <w:ilvl w:val="0"/>
-          <w:numId w:val="19"/>
-        </w:numPr>
-      </w:pPr>
-      <w:r>
-        <w:t>Over a decade of hands-on experience taking AI systems from research to production at Amdocs, Diagnostic Robotics, DICTA, and MashInnovateAI, the AI R&amp;D consultancy I founded.</w:t>
-      </w:r>
-    </w:p>
-    <w:p>
-      <w:r>
-        <w:rPr>
-          <w:rFonts w:ascii="Calibri" w:eastAsia="Calibri" w:hAnsi="Calibri"/>
-        </w:rPr>
-        <w:pict w14:anchorId="050FCB5C">
-          <v:rect id="_x0000_i1028" style="width:0;height:1.5pt" o:hralign="center" o:hrstd="t" o:hrnoshade="t" o:hr="t" fillcolor="gray" stroked="f"/>
         </w:pict>
       </w:r>
     </w:p>

</xml_diff>

<commit_message>
Rewrite the DICTA entry around projects and responsibilities
Co-Authored-By: Claude Fable 5.1 <noreply@anthropic.com>
Claude-Session: https://claude.ai/code/session_01P2fsSpp5LJyrgm7ofHkpMm
</commit_message>
<xml_diff>
--- a/cv/Moshe_Mash_CV.docx
+++ b/cv/Moshe_Mash_CV.docx
@@ -750,7 +750,7 @@
         <w:rPr>
           <w:rFonts w:ascii="Calibri" w:eastAsia="Calibri" w:hAnsi="Calibri"/>
         </w:rPr>
-        <w:t>Lead text-understanding research over large, unstructured Hebrew and rabbinic document collections - turning raw text into structured, searchable, analyzable data.</w:t>
+        <w:t>Lead the center's NLP and LLM research on large collections of Hebrew and rabbinic texts: set the research agenda, design the methods, and take systems from prototype to tools in active use by scholars.</w:t>
       </w:r>
     </w:p>
     <w:p>
@@ -764,7 +764,7 @@
         <w:rPr>
           <w:rFonts w:ascii="Calibri" w:eastAsia="Calibri" w:hAnsi="Calibri"/>
         </w:rPr>
-        <w:t xml:space="preserve">Built systems and deep-learning models for in-depth analysis of text - morphological, syntactic, and semantic understanding of long, complex documents at scale.</w:t>
+        <w:t>Authorship attribution: built models that predict the author of texts with historically disputed attribution from textual signals alone, reaching high accuracy and resolving long-debated questions of authorship.</w:t>
       </w:r>
     </w:p>
     <w:p>
@@ -778,8 +778,7 @@
         <w:rPr>
           <w:rFonts w:ascii="Calibri" w:eastAsia="Calibri" w:hAnsi="Calibri"/>
         </w:rPr>
-        <w:lastRenderedPageBreak/>
-        <w:t>Built NLP models for authorship attribution and document classification - predicting the author of texts with historically disputed attribution from textual signals alone.</w:t>
+        <w:t>Citation detection and cross-referencing: designed systems that automatically detect, extract, and link citations of classical sources across a large corpus, connecting documents that quote or paraphrase one another.</w:t>
       </w:r>
     </w:p>
     <w:p>
@@ -793,7 +792,7 @@
         <w:rPr>
           <w:rFonts w:ascii="Calibri" w:eastAsia="Calibri" w:hAnsi="Calibri"/>
         </w:rPr>
-        <w:t>Reached high predictive accuracy and applied these models to resolve long-debated questions of authorship, demonstrating reliable classification of ambiguous documents at scale.</w:t>
+        <w:t>Document understanding with LLMs: fine-tuned LLMs and trained custom text embeddings with contrastive learning for domain-specific corpora, powering information extraction, semantic search, text similarity, clustering, and question answering over long, complex documents.</w:t>
       </w:r>
     </w:p>
     <w:p>
@@ -807,7 +806,7 @@
         <w:rPr>
           <w:rFonts w:ascii="Calibri" w:eastAsia="Calibri" w:hAnsi="Calibri"/>
         </w:rPr>
-        <w:t>Designed systems for automatic citation detection, extraction, and cross-referencing of sources across a large document corpus.</w:t>
+        <w:t>Linguistic analysis: built deep-learning models for morphological, syntactic, and semantic analysis of long, complex documents at scale.</w:t>
       </w:r>
     </w:p>
     <w:p>
@@ -821,35 +820,7 @@
         <w:rPr>
           <w:rFonts w:ascii="Calibri" w:eastAsia="Calibri" w:hAnsi="Calibri"/>
         </w:rPr>
-        <w:t>Built LLM-based tools for information extraction, semantic search, text similarity, clustering, and question-answering over documents - training custom text embeddings with contrastive learning and fine-tuning LLMs for domain-specific corpora.</w:t>
-      </w:r>
-    </w:p>
-    <w:p>
-      <w:pPr>
-        <w:numPr>
-          <w:ilvl w:val="0"/>
-          <w:numId w:val="21"/>
-        </w:numPr>
-      </w:pPr>
-      <w:r>
-        <w:rPr>
-          <w:rFonts w:ascii="Calibri" w:eastAsia="Calibri" w:hAnsi="Calibri"/>
-        </w:rPr>
-        <w:t xml:space="preserve">Built end-to-end systems for model training and inference, with tooling to analyze model outcomes and inspect the training process itself.</w:t>
-      </w:r>
-    </w:p>
-    <w:p>
-      <w:pPr>
-        <w:numPr>
-          <w:ilvl w:val="0"/>
-          <w:numId w:val="21"/>
-        </w:numPr>
-      </w:pPr>
-      <w:r>
-        <w:rPr>
-          <w:rFonts w:ascii="Calibri" w:eastAsia="Calibri" w:hAnsi="Calibri"/>
-        </w:rPr>
-        <w:t>Took models from research through to production deployment, delivering document-understanding systems actively used for live analysis of large text collections.</w:t>
+        <w:t>Infrastructure and deployment: built the end-to-end training and inference pipeline, with tooling to analyze model outcomes and inspect the training process, and deployed the resulting document-understanding systems to production.</w:t>
       </w:r>
     </w:p>
     <w:p>

</xml_diff>

<commit_message>
Write the CV research interests as prose matching the website
Co-Authored-By: Claude Fable 5.1 <noreply@anthropic.com>
Claude-Session: https://claude.ai/code/session_01P2fsSpp5LJyrgm7ofHkpMm
</commit_message>
<xml_diff>
--- a/cv/Moshe_Mash_CV.docx
+++ b/cv/Moshe_Mash_CV.docx
@@ -81,7 +81,23 @@
         <w:rPr>
           <w:rFonts w:ascii="Calibri" w:eastAsia="Calibri" w:hAnsi="Calibri"/>
         </w:rPr>
-        <w:t>Multi-Agent Systems; Game Theory and Mechanism Design; Social Choice and Fair Division; Human-AI Collaboration and Mixed Human-Agent Settings; Decision-Making by Artificial Agents and Humans; Modeling and Prediction of Human Behavior; Analysis of Data Science and Machine Learning Workflows; Natural Language Processing and Large Language Models; Computational Analysis of Specialized Text Corpora (Hebrew and rabbinic texts, legal and patent documents); Human-Centered AI.</w:t>
+        <w:t>My research centers on environments shared by humans and computer agents: how they interact, coordinate, and reach agreements, and how to design agents that act well alongside people. I combine game theory and mechanism design with machine learning to model, predict, and shape behavior in such settings, from joint exploration and negotiation to coalition formation and fair division. I am developing a new direction that extends this to LLM-based agents: learning what an agent should communicate to a human, and how, from human preference, in mixed human-agent settings such as autonomous and human-driven vehicles.</w:t>
+      </w:r>
+    </w:p>
+    <w:p>
+      <w:r>
+        <w:rPr>
+          <w:rFonts w:ascii="Calibri" w:eastAsia="Calibri" w:hAnsi="Calibri"/>
+        </w:rPr>
+        <w:t>A related line of work, begun during my postdoc at Carnegie Mellon, studies the people who build AI systems: capturing and modeling the workflows of data scientists as they develop machine learning models, and predicting the moments where they get stuck so that tools can offer targeted support.</w:t>
+      </w:r>
+    </w:p>
+    <w:p>
+      <w:r>
+        <w:rPr>
+          <w:rFonts w:ascii="Calibri" w:eastAsia="Calibri" w:hAnsi="Calibri"/>
+        </w:rPr>
+        <w:t>A third, applied strand of my research uses large language models and modern NLP for text analysis in specialized domains: authorship attribution, automatic citation generation, and semantic cross-referencing of Hebrew and rabbinic texts (with DICTA), and computational analysis of legal and patent text, including textual studies of disparate outcomes in the patent system. Both involve fine-tuning LLMs for prediction, clustering, and semantic analysis of domain-specific corpora.</w:t>
       </w:r>
     </w:p>
     <w:p>

</xml_diff>

<commit_message>
Restructure the CV around the research
- Add a research paragraph under the Ph.D. (fair division and coalition
  formation) and the M.Sc. (joint exploration with self-interested agents),
  drawn from the published papers; note mentoring during the Ph.D.
- Replace the postdoc bullets with prose on the DSWorkFlow and stuckness
  research, naming the hosts, mentoring, and the J.P. Morgan funding
- Move the Weizmann research assistantship out of Academic Positions into
  the experience section, renamed Professional Experience

Co-Authored-By: Claude Fable 5.1 <noreply@anthropic.com>
Claude-Session: https://claude.ai/code/session_01P2fsSpp5LJyrgm7ofHkpMm
</commit_message>
<xml_diff>
--- a/cv/Moshe_Mash_CV.docx
+++ b/cv/Moshe_Mash_CV.docx
@@ -212,6 +212,14 @@
       <w:r>
         <w:rPr>
           <w:rFonts w:ascii="Calibri" w:eastAsia="Calibri" w:hAnsi="Calibri"/>
+        </w:rPr>
+        <w:t>Dissertation research on how people and computer agents reach fair agreements in group settings. One line of work developed algorithms for fair division: a general framework for computing envy-free rent divisions that optimize a criterion of social justice, identifying the maximin solution as the fairest. It was validated in a user study with real users of the Spliddit website and has been deployed on Spliddit since 2015 (ACM EC 2016 Best Paper Award; JACM; Communications of the ACM Research Highlight). A second line studied coalition formation in weighted voting games, combining cooperative game theory with machine learning to predict how people form coalitions, and designing an agent that negotiates with people and outperformed human players (IJCAI 2017; ACM TIST). Mentored undergraduate students and advised final-year projects throughout the Ph.D.</w:t>
+      </w:r>
+    </w:p>
+    <w:p>
+      <w:r>
+        <w:rPr>
+          <w:rFonts w:ascii="Calibri" w:eastAsia="Calibri" w:hAnsi="Calibri"/>
           <w:b/>
           <w:bCs/>
         </w:rPr>
@@ -294,6 +302,14 @@
       <w:r>
         <w:rPr>
           <w:rFonts w:ascii="Calibri" w:eastAsia="Calibri" w:hAnsi="Calibri"/>
+        </w:rPr>
+        <w:t>Thesis research on joint exploration by self-interested agents: settings in which several agents search for opportunities whose values are uncertain and costly to reveal, and share what they find. Using equilibrium analysis, the work showed that mechanisms intended to enhance cooperation, such as longer search horizons or more cooperating agents, can degrade individual and overall utility when agents are self-interested, with implications for the design of multi-agent markets and systems (Artificial Intelligence Journal; IAT 2012).</w:t>
+      </w:r>
+    </w:p>
+    <w:p>
+      <w:r>
+        <w:rPr>
+          <w:rFonts w:ascii="Calibri" w:eastAsia="Calibri" w:hAnsi="Calibri"/>
           <w:b/>
           <w:bCs/>
         </w:rPr>
@@ -518,6 +534,63 @@
       </w:r>
     </w:p>
     <w:p>
+      <w:r>
+        <w:rPr>
+          <w:rFonts w:ascii="Calibri" w:eastAsia="Calibri" w:hAnsi="Calibri"/>
+        </w:rPr>
+        <w:t>Hosted by Prof. Reid Simmons and Dr. Stephanie Rosenthal. My research studied the people who build AI systems: how machine learning practitioners and data scientists work as they develop models, and where they get stuck. I developed DSWorkFlow, a framework that captures data scientists' workflows from Jupyter notebooks, reconstructs the order in which code was executed, and combines it with qualitative data, and used it in studies of data scientists building machine learning models (CHI). Building on that data, I developed a model that predicts stuckness from real-time indicators such as code artifacts, and an algorithm that times an intervention as close as possible to the onset of stuckness (VL/HCC).</w:t>
+      </w:r>
+    </w:p>
+    <w:p>
+      <w:r>
+        <w:rPr>
+          <w:rFonts w:ascii="Calibri" w:eastAsia="Calibri" w:hAnsi="Calibri"/>
+        </w:rPr>
+        <w:t>I mentored students in AI and human-computer interaction research. The research was funded by J.P. Morgan, which renewed the award for a second consecutive year based on the project's results.</w:t>
+      </w:r>
+    </w:p>
+    <w:p>
+      <w:r>
+        <w:rPr>
+          <w:rFonts w:ascii="Calibri" w:eastAsia="Calibri" w:hAnsi="Calibri"/>
+        </w:rPr>
+        <w:pict w14:anchorId="69FF5FEC">
+          <v:rect id="_x0000_i1027" style="width:0;height:1.5pt" o:hralign="center" o:hrstd="t" o:hrnoshade="t" o:hr="t" fillcolor="gray" stroked="f"/>
+        </w:pict>
+      </w:r>
+    </w:p>
+    <w:p>
+      <w:pPr>
+        <w:rPr>
+          <w:b/>
+          <w:bCs/>
+        </w:rPr>
+      </w:pPr>
+      <w:r>
+        <w:rPr>
+          <w:rFonts w:ascii="Calibri" w:eastAsia="Calibri" w:hAnsi="Calibri"/>
+          <w:b/>
+          <w:bCs/>
+        </w:rPr>
+        <w:t>Professional Experience</w:t>
+      </w:r>
+    </w:p>
+    <w:p>
+      <w:pPr>
+        <w:rPr>
+          <w:b/>
+          <w:bCs/>
+        </w:rPr>
+      </w:pPr>
+      <w:r>
+        <w:rPr>
+          <w:b/>
+          <w:bCs/>
+        </w:rPr>
+        <w:t>Principal AI Researcher &amp; Founder | MashInnovateAI | 2024–present</w:t>
+      </w:r>
+    </w:p>
+    <w:p>
       <w:pPr>
         <w:numPr>
           <w:ilvl w:val="0"/>
@@ -525,104 +598,249 @@
         </w:numPr>
       </w:pPr>
       <w:r>
-        <w:t xml:space="preserve">Hosted by </w:t>
-      </w:r>
-      <w:r>
-        <w:t>Prof. Reid Simmons</w:t>
-      </w:r>
-      <w:r>
-        <w:t xml:space="preserve"> and </w:t>
-      </w:r>
-      <w:r>
-        <w:t>Dr. Stephanie Rosenthal</w:t>
-      </w:r>
-      <w:r>
-        <w:t>.</w:t>
+        <w:t>Independent AI research &amp; development consultancy: helps organizations identify where AI can solve their hardest problems, then designs and delivers the solution end to end - applied ML, NLP, LLM fine-tuning, RAG, and agentic and multi-agent systems - from proof of concept to production deployment.</w:t>
       </w:r>
     </w:p>
     <w:p>
       <w:pPr>
         <w:numPr>
           <w:ilvl w:val="0"/>
-          <w:numId w:val="22"/>
+          <w:numId w:val="21"/>
         </w:numPr>
       </w:pPr>
       <w:r>
-        <w:rPr>
-          <w:rFonts w:ascii="Calibri" w:eastAsia="Calibri" w:hAnsi="Calibri"/>
-        </w:rPr>
-        <w:lastRenderedPageBreak/>
-        <w:t>Conducted research on the behavior and cognitive processes of machine learning practitioners as they develop AI models.</w:t>
+        <w:t>Clients include technology companies looking to integrate AI into their products and workflows, startups, and universities and academic research groups.</w:t>
+      </w:r>
+    </w:p>
+    <w:p>
+      <w:pPr>
+        <w:rPr>
+          <w:b/>
+          <w:bCs/>
+        </w:rPr>
+      </w:pPr>
+      <w:r>
+        <w:rPr>
+          <w:b/>
+          <w:bCs/>
+        </w:rPr>
+        <w:t>AI Researcher | DICTA – The Israel Center for Text Analysis | 2022–present</w:t>
       </w:r>
     </w:p>
     <w:p>
       <w:pPr>
         <w:numPr>
           <w:ilvl w:val="0"/>
-          <w:numId w:val="22"/>
+          <w:numId w:val="21"/>
         </w:numPr>
       </w:pPr>
       <w:r>
         <w:rPr>
           <w:rFonts w:ascii="Calibri" w:eastAsia="Calibri" w:hAnsi="Calibri"/>
         </w:rPr>
-        <w:t>Designed frameworks to capture, model, and analyze workflows, with emphasis on decision-making, iteration cycles, and knowledge bottlenecks.</w:t>
+        <w:t>Lead the center's NLP and LLM research on large collections of Hebrew and rabbinic texts: set the research agenda, design the methods, and take systems from prototype to tools in active use by scholars.</w:t>
       </w:r>
     </w:p>
     <w:p>
       <w:pPr>
         <w:numPr>
           <w:ilvl w:val="0"/>
-          <w:numId w:val="22"/>
+          <w:numId w:val="21"/>
         </w:numPr>
       </w:pPr>
       <w:r>
         <w:rPr>
           <w:rFonts w:ascii="Calibri" w:eastAsia="Calibri" w:hAnsi="Calibri"/>
         </w:rPr>
-        <w:t>Developed predictive methods to identify critical moments of difficulty (“stuckness”) in ML development, enabling targeted support and improved productivity.</w:t>
+        <w:t>Authorship attribution: built models that predict the author of texts with historically disputed attribution from textual signals alone, reaching high accuracy and resolving long-debated questions of authorship.</w:t>
       </w:r>
     </w:p>
     <w:p>
       <w:pPr>
         <w:numPr>
           <w:ilvl w:val="0"/>
-          <w:numId w:val="22"/>
+          <w:numId w:val="21"/>
         </w:numPr>
       </w:pPr>
       <w:r>
         <w:rPr>
           <w:rFonts w:ascii="Calibri" w:eastAsia="Calibri" w:hAnsi="Calibri"/>
         </w:rPr>
-        <w:t>Collaborated with multidisciplinary teams to integrate human-centric AI approaches into machine learning tools and environments.</w:t>
+        <w:t>Citation detection and cross-referencing: designed systems that automatically detect, extract, and link citations of classical sources across a large corpus, connecting documents that quote or paraphrase one another.</w:t>
       </w:r>
     </w:p>
     <w:p>
       <w:pPr>
         <w:numPr>
           <w:ilvl w:val="0"/>
-          <w:numId w:val="22"/>
+          <w:numId w:val="21"/>
         </w:numPr>
       </w:pPr>
       <w:r>
         <w:rPr>
           <w:rFonts w:ascii="Calibri" w:eastAsia="Calibri" w:hAnsi="Calibri"/>
         </w:rPr>
-        <w:t>Mentored students in AI and human-computer interaction research.</w:t>
+        <w:t>Document understanding with LLMs: fine-tuned LLMs and trained custom text embeddings with contrastive learning for domain-specific corpora, powering information extraction, semantic search, text similarity, clustering, and question answering over long, complex documents.</w:t>
       </w:r>
     </w:p>
     <w:p>
       <w:pPr>
         <w:numPr>
           <w:ilvl w:val="0"/>
-          <w:numId w:val="22"/>
+          <w:numId w:val="21"/>
         </w:numPr>
       </w:pPr>
       <w:r>
         <w:rPr>
           <w:rFonts w:ascii="Calibri" w:eastAsia="Calibri" w:hAnsi="Calibri"/>
         </w:rPr>
-        <w:t>Research funded by J.P. Morgan, which renewed the award for a second consecutive year based on the project's strong results.</w:t>
+        <w:t>Linguistic analysis: built deep-learning models for morphological, syntactic, and semantic analysis of long, complex documents at scale.</w:t>
+      </w:r>
+    </w:p>
+    <w:p>
+      <w:pPr>
+        <w:numPr>
+          <w:ilvl w:val="0"/>
+          <w:numId w:val="21"/>
+        </w:numPr>
+      </w:pPr>
+      <w:r>
+        <w:rPr>
+          <w:rFonts w:ascii="Calibri" w:eastAsia="Calibri" w:hAnsi="Calibri"/>
+        </w:rPr>
+        <w:t>Infrastructure and deployment: built the end-to-end training and inference pipeline, with tooling to analyze model outcomes and inspect the training process, and deployed the resulting document-understanding systems to production.</w:t>
+      </w:r>
+    </w:p>
+    <w:p>
+      <w:r>
+        <w:rPr>
+          <w:rFonts w:ascii="Calibri" w:eastAsia="Calibri" w:hAnsi="Calibri"/>
+          <w:b/>
+          <w:bCs/>
+        </w:rPr>
+        <w:t>AI Researcher</w:t>
+      </w:r>
+      <w:r>
+        <w:rPr>
+          <w:rFonts w:ascii="Calibri" w:eastAsia="Calibri" w:hAnsi="Calibri"/>
+        </w:rPr>
+        <w:t xml:space="preserve"> | </w:t>
+      </w:r>
+      <w:r>
+        <w:rPr>
+          <w:rFonts w:ascii="Calibri" w:eastAsia="Calibri" w:hAnsi="Calibri"/>
+          <w:b/>
+          <w:bCs/>
+        </w:rPr>
+        <w:t>Diagnostic Robotics</w:t>
+      </w:r>
+      <w:r>
+        <w:rPr>
+          <w:rFonts w:ascii="Calibri" w:eastAsia="Calibri" w:hAnsi="Calibri"/>
+        </w:rPr>
+        <w:t xml:space="preserve"> | </w:t>
+      </w:r>
+      <w:r>
+        <w:rPr>
+          <w:rFonts w:ascii="Calibri" w:eastAsia="Calibri" w:hAnsi="Calibri"/>
+          <w:b/>
+          <w:bCs/>
+        </w:rPr>
+        <w:t>2019</w:t>
+      </w:r>
+    </w:p>
+    <w:p>
+      <w:pPr>
+        <w:numPr>
+          <w:ilvl w:val="0"/>
+          <w:numId w:val="24"/>
+        </w:numPr>
+      </w:pPr>
+      <w:r>
+        <w:rPr>
+          <w:rFonts w:ascii="Calibri" w:eastAsia="Calibri" w:hAnsi="Calibri"/>
+        </w:rPr>
+        <w:t>Developed machine learning models for the healthcare domain, with applications in risk prediction (e.g., ER diagnoses, hospitalization forecasting).</w:t>
+      </w:r>
+    </w:p>
+    <w:p>
+      <w:pPr>
+        <w:numPr>
+          <w:ilvl w:val="0"/>
+          <w:numId w:val="24"/>
+        </w:numPr>
+      </w:pPr>
+      <w:r>
+        <w:rPr>
+          <w:rFonts w:ascii="Calibri" w:eastAsia="Calibri" w:hAnsi="Calibri"/>
+        </w:rPr>
+        <w:t>Collaborated with clinicians and researchers to refine AI-driven predictive healthcare decision-support systems.</w:t>
+      </w:r>
+    </w:p>
+    <w:p>
+      <w:r>
+        <w:rPr>
+          <w:rFonts w:ascii="Calibri" w:eastAsia="Calibri" w:hAnsi="Calibri"/>
+          <w:b/>
+          <w:bCs/>
+        </w:rPr>
+        <w:t>AI Researcher</w:t>
+      </w:r>
+      <w:r>
+        <w:rPr>
+          <w:rFonts w:ascii="Calibri" w:eastAsia="Calibri" w:hAnsi="Calibri"/>
+        </w:rPr>
+        <w:t xml:space="preserve"> | </w:t>
+      </w:r>
+      <w:r>
+        <w:rPr>
+          <w:rFonts w:ascii="Calibri" w:eastAsia="Calibri" w:hAnsi="Calibri"/>
+          <w:b/>
+          <w:bCs/>
+        </w:rPr>
+        <w:t>Amdocs</w:t>
+      </w:r>
+      <w:r>
+        <w:rPr>
+          <w:rFonts w:ascii="Calibri" w:eastAsia="Calibri" w:hAnsi="Calibri"/>
+        </w:rPr>
+        <w:t xml:space="preserve"> | </w:t>
+      </w:r>
+      <w:r>
+        <w:rPr>
+          <w:rFonts w:ascii="Calibri" w:eastAsia="Calibri" w:hAnsi="Calibri"/>
+          <w:b/>
+          <w:bCs/>
+        </w:rPr>
+        <w:t>2018–2019</w:t>
+      </w:r>
+    </w:p>
+    <w:p>
+      <w:pPr>
+        <w:numPr>
+          <w:ilvl w:val="0"/>
+          <w:numId w:val="25"/>
+        </w:numPr>
+      </w:pPr>
+      <w:r>
+        <w:rPr>
+          <w:rFonts w:ascii="Calibri" w:eastAsia="Calibri" w:hAnsi="Calibri"/>
+        </w:rPr>
+        <w:t>Led the development of a churn-prediction system for at-risk maintenance contract renewals, saving millions of dollars.</w:t>
+      </w:r>
+    </w:p>
+    <w:p>
+      <w:pPr>
+        <w:numPr>
+          <w:ilvl w:val="0"/>
+          <w:numId w:val="25"/>
+        </w:numPr>
+      </w:pPr>
+      <w:r>
+        <w:rPr>
+          <w:rFonts w:ascii="Calibri" w:eastAsia="Calibri" w:hAnsi="Calibri"/>
+        </w:rPr>
+        <w:t>Designed, built, and deployed the system from scratch, including problem definition, algorithm design, evaluation, and deployment pipeline.</w:t>
       </w:r>
     </w:p>
     <w:p>
@@ -675,300 +893,6 @@
           <w:rFonts w:ascii="Calibri" w:eastAsia="Calibri" w:hAnsi="Calibri"/>
         </w:rPr>
         <w:t>Developed image-processing algorithms for 3D biomedical images.</w:t>
-      </w:r>
-    </w:p>
-    <w:p>
-      <w:r>
-        <w:rPr>
-          <w:rFonts w:ascii="Calibri" w:eastAsia="Calibri" w:hAnsi="Calibri"/>
-        </w:rPr>
-        <w:pict w14:anchorId="69FF5FEC">
-          <v:rect id="_x0000_i1027" style="width:0;height:1.5pt" o:hralign="center" o:hrstd="t" o:hrnoshade="t" o:hr="t" fillcolor="gray" stroked="f"/>
-        </w:pict>
-      </w:r>
-    </w:p>
-    <w:p>
-      <w:pPr>
-        <w:rPr>
-          <w:b/>
-          <w:bCs/>
-        </w:rPr>
-      </w:pPr>
-      <w:r>
-        <w:rPr>
-          <w:rFonts w:ascii="Calibri" w:eastAsia="Calibri" w:hAnsi="Calibri"/>
-          <w:b/>
-          <w:bCs/>
-        </w:rPr>
-        <w:t>Industry Research Positions</w:t>
-      </w:r>
-    </w:p>
-    <w:p>
-      <w:pPr>
-        <w:rPr>
-          <w:b/>
-          <w:bCs/>
-        </w:rPr>
-      </w:pPr>
-      <w:r>
-        <w:rPr>
-          <w:b/>
-          <w:bCs/>
-        </w:rPr>
-        <w:t>Principal AI Researcher &amp; Founder | MashInnovateAI | 2024–present</w:t>
-      </w:r>
-    </w:p>
-    <w:p>
-      <w:pPr>
-        <w:numPr>
-          <w:ilvl w:val="0"/>
-          <w:numId w:val="21"/>
-        </w:numPr>
-      </w:pPr>
-      <w:r>
-        <w:t>Independent AI research &amp; development consultancy: helps organizations identify where AI can solve their hardest problems, then designs and delivers the solution end to end - applied ML, NLP, LLM fine-tuning, RAG, and agentic and multi-agent systems - from proof of concept to production deployment.</w:t>
-      </w:r>
-    </w:p>
-    <w:p>
-      <w:pPr>
-        <w:numPr>
-          <w:ilvl w:val="0"/>
-          <w:numId w:val="21"/>
-        </w:numPr>
-      </w:pPr>
-      <w:r>
-        <w:t>Clients include technology companies looking to integrate AI into their products and workflows, startups, and universities and academic research groups.</w:t>
-      </w:r>
-    </w:p>
-    <w:p>
-      <w:pPr>
-        <w:rPr>
-          <w:b/>
-          <w:bCs/>
-        </w:rPr>
-      </w:pPr>
-      <w:r>
-        <w:rPr>
-          <w:b/>
-          <w:bCs/>
-        </w:rPr>
-        <w:t>AI Researcher | DICTA – The Israel Center for Text Analysis | 2022–present</w:t>
-      </w:r>
-    </w:p>
-    <w:p>
-      <w:pPr>
-        <w:numPr>
-          <w:ilvl w:val="0"/>
-          <w:numId w:val="21"/>
-        </w:numPr>
-      </w:pPr>
-      <w:r>
-        <w:rPr>
-          <w:rFonts w:ascii="Calibri" w:eastAsia="Calibri" w:hAnsi="Calibri"/>
-        </w:rPr>
-        <w:t>Lead the center's NLP and LLM research on large collections of Hebrew and rabbinic texts: set the research agenda, design the methods, and take systems from prototype to tools in active use by scholars.</w:t>
-      </w:r>
-    </w:p>
-    <w:p>
-      <w:pPr>
-        <w:numPr>
-          <w:ilvl w:val="0"/>
-          <w:numId w:val="21"/>
-        </w:numPr>
-      </w:pPr>
-      <w:r>
-        <w:rPr>
-          <w:rFonts w:ascii="Calibri" w:eastAsia="Calibri" w:hAnsi="Calibri"/>
-        </w:rPr>
-        <w:t>Authorship attribution: built models that predict the author of texts with historically disputed attribution from textual signals alone, reaching high accuracy and resolving long-debated questions of authorship.</w:t>
-      </w:r>
-    </w:p>
-    <w:p>
-      <w:pPr>
-        <w:numPr>
-          <w:ilvl w:val="0"/>
-          <w:numId w:val="21"/>
-        </w:numPr>
-      </w:pPr>
-      <w:r>
-        <w:rPr>
-          <w:rFonts w:ascii="Calibri" w:eastAsia="Calibri" w:hAnsi="Calibri"/>
-        </w:rPr>
-        <w:t>Citation detection and cross-referencing: designed systems that automatically detect, extract, and link citations of classical sources across a large corpus, connecting documents that quote or paraphrase one another.</w:t>
-      </w:r>
-    </w:p>
-    <w:p>
-      <w:pPr>
-        <w:numPr>
-          <w:ilvl w:val="0"/>
-          <w:numId w:val="21"/>
-        </w:numPr>
-      </w:pPr>
-      <w:r>
-        <w:rPr>
-          <w:rFonts w:ascii="Calibri" w:eastAsia="Calibri" w:hAnsi="Calibri"/>
-        </w:rPr>
-        <w:t>Document understanding with LLMs: fine-tuned LLMs and trained custom text embeddings with contrastive learning for domain-specific corpora, powering information extraction, semantic search, text similarity, clustering, and question answering over long, complex documents.</w:t>
-      </w:r>
-    </w:p>
-    <w:p>
-      <w:pPr>
-        <w:numPr>
-          <w:ilvl w:val="0"/>
-          <w:numId w:val="21"/>
-        </w:numPr>
-      </w:pPr>
-      <w:r>
-        <w:rPr>
-          <w:rFonts w:ascii="Calibri" w:eastAsia="Calibri" w:hAnsi="Calibri"/>
-        </w:rPr>
-        <w:t>Linguistic analysis: built deep-learning models for morphological, syntactic, and semantic analysis of long, complex documents at scale.</w:t>
-      </w:r>
-    </w:p>
-    <w:p>
-      <w:pPr>
-        <w:numPr>
-          <w:ilvl w:val="0"/>
-          <w:numId w:val="21"/>
-        </w:numPr>
-      </w:pPr>
-      <w:r>
-        <w:rPr>
-          <w:rFonts w:ascii="Calibri" w:eastAsia="Calibri" w:hAnsi="Calibri"/>
-        </w:rPr>
-        <w:t>Infrastructure and deployment: built the end-to-end training and inference pipeline, with tooling to analyze model outcomes and inspect the training process, and deployed the resulting document-understanding systems to production.</w:t>
-      </w:r>
-    </w:p>
-    <w:p>
-      <w:r>
-        <w:rPr>
-          <w:rFonts w:ascii="Calibri" w:eastAsia="Calibri" w:hAnsi="Calibri"/>
-          <w:b/>
-          <w:bCs/>
-        </w:rPr>
-        <w:t>AI Researcher</w:t>
-      </w:r>
-      <w:r>
-        <w:rPr>
-          <w:rFonts w:ascii="Calibri" w:eastAsia="Calibri" w:hAnsi="Calibri"/>
-        </w:rPr>
-        <w:t xml:space="preserve"> | </w:t>
-      </w:r>
-      <w:r>
-        <w:rPr>
-          <w:rFonts w:ascii="Calibri" w:eastAsia="Calibri" w:hAnsi="Calibri"/>
-          <w:b/>
-          <w:bCs/>
-        </w:rPr>
-        <w:t>Diagnostic Robotics</w:t>
-      </w:r>
-      <w:r>
-        <w:rPr>
-          <w:rFonts w:ascii="Calibri" w:eastAsia="Calibri" w:hAnsi="Calibri"/>
-        </w:rPr>
-        <w:t xml:space="preserve"> | </w:t>
-      </w:r>
-      <w:r>
-        <w:rPr>
-          <w:rFonts w:ascii="Calibri" w:eastAsia="Calibri" w:hAnsi="Calibri"/>
-          <w:b/>
-          <w:bCs/>
-        </w:rPr>
-        <w:t>2019</w:t>
-      </w:r>
-    </w:p>
-    <w:p>
-      <w:pPr>
-        <w:numPr>
-          <w:ilvl w:val="0"/>
-          <w:numId w:val="24"/>
-        </w:numPr>
-      </w:pPr>
-      <w:r>
-        <w:rPr>
-          <w:rFonts w:ascii="Calibri" w:eastAsia="Calibri" w:hAnsi="Calibri"/>
-        </w:rPr>
-        <w:t>Developed machine learning models for the healthcare domain, with applications in risk prediction (e.g., ER diagnoses, hospitalization forecasting).</w:t>
-      </w:r>
-    </w:p>
-    <w:p>
-      <w:pPr>
-        <w:numPr>
-          <w:ilvl w:val="0"/>
-          <w:numId w:val="24"/>
-        </w:numPr>
-      </w:pPr>
-      <w:r>
-        <w:rPr>
-          <w:rFonts w:ascii="Calibri" w:eastAsia="Calibri" w:hAnsi="Calibri"/>
-        </w:rPr>
-        <w:t>Collaborated with clinicians and researchers to refine AI-driven predictive healthcare decision-support systems.</w:t>
-      </w:r>
-    </w:p>
-    <w:p>
-      <w:r>
-        <w:rPr>
-          <w:rFonts w:ascii="Calibri" w:eastAsia="Calibri" w:hAnsi="Calibri"/>
-          <w:b/>
-          <w:bCs/>
-        </w:rPr>
-        <w:t>AI Researcher</w:t>
-      </w:r>
-      <w:r>
-        <w:rPr>
-          <w:rFonts w:ascii="Calibri" w:eastAsia="Calibri" w:hAnsi="Calibri"/>
-        </w:rPr>
-        <w:t xml:space="preserve"> | </w:t>
-      </w:r>
-      <w:r>
-        <w:rPr>
-          <w:rFonts w:ascii="Calibri" w:eastAsia="Calibri" w:hAnsi="Calibri"/>
-          <w:b/>
-          <w:bCs/>
-        </w:rPr>
-        <w:t>Amdocs</w:t>
-      </w:r>
-      <w:r>
-        <w:rPr>
-          <w:rFonts w:ascii="Calibri" w:eastAsia="Calibri" w:hAnsi="Calibri"/>
-        </w:rPr>
-        <w:t xml:space="preserve"> | </w:t>
-      </w:r>
-      <w:r>
-        <w:rPr>
-          <w:rFonts w:ascii="Calibri" w:eastAsia="Calibri" w:hAnsi="Calibri"/>
-          <w:b/>
-          <w:bCs/>
-        </w:rPr>
-        <w:t>2018–2019</w:t>
-      </w:r>
-    </w:p>
-    <w:p>
-      <w:pPr>
-        <w:numPr>
-          <w:ilvl w:val="0"/>
-          <w:numId w:val="25"/>
-        </w:numPr>
-      </w:pPr>
-      <w:r>
-        <w:rPr>
-          <w:rFonts w:ascii="Calibri" w:eastAsia="Calibri" w:hAnsi="Calibri"/>
-        </w:rPr>
-        <w:t>Led the development of a churn-prediction system for at-risk maintenance contract renewals, saving millions of dollars.</w:t>
-      </w:r>
-    </w:p>
-    <w:p>
-      <w:pPr>
-        <w:numPr>
-          <w:ilvl w:val="0"/>
-          <w:numId w:val="25"/>
-        </w:numPr>
-      </w:pPr>
-      <w:r>
-        <w:rPr>
-          <w:rFonts w:ascii="Calibri" w:eastAsia="Calibri" w:hAnsi="Calibri"/>
-        </w:rPr>
-        <w:t>Designed, built, and deployed the system from scratch, including problem definition, algorithm design, evaluation, and deployment pipeline.</w:t>
       </w:r>
     </w:p>
     <w:p>

</xml_diff>

<commit_message>
Frame LLM-based agents as a future interest; say ML practitioners
Co-Authored-By: Claude Fable 5.1 <noreply@anthropic.com>
Claude-Session: https://claude.ai/code/session_01P2fsSpp5LJyrgm7ofHkpMm
</commit_message>
<xml_diff>
--- a/cv/Moshe_Mash_CV.docx
+++ b/cv/Moshe_Mash_CV.docx
@@ -81,15 +81,15 @@
         <w:rPr>
           <w:rFonts w:ascii="Calibri" w:eastAsia="Calibri" w:hAnsi="Calibri"/>
         </w:rPr>
-        <w:t>My research centers on environments shared by humans and computer agents: how they interact, coordinate, and reach agreements, and how to design agents that act well alongside people. I combine game theory and mechanism design with machine learning to model, predict, and shape behavior in such settings, from joint exploration and negotiation to coalition formation and fair division. I am developing a new direction that extends this to LLM-based agents: learning what an agent should communicate to a human, and how, from human preference, in mixed human-agent settings such as autonomous and human-driven vehicles.</w:t>
-      </w:r>
-    </w:p>
-    <w:p>
-      <w:r>
-        <w:rPr>
-          <w:rFonts w:ascii="Calibri" w:eastAsia="Calibri" w:hAnsi="Calibri"/>
-        </w:rPr>
-        <w:t>A related line of work, begun during my postdoc at Carnegie Mellon, studies the people who build AI systems: capturing and modeling the workflows of data scientists as they develop machine learning models, and predicting the moments where they get stuck so that tools can offer targeted support.</w:t>
+        <w:t>My research centers on environments shared by humans and computer agents: how they interact, coordinate, and reach agreements, and how to design agents that act well alongside people. I combine game theory and mechanism design with machine learning to model, predict, and shape behavior in such settings, from joint exploration and negotiation to coalition formation and fair division. I am interested in extending this line to LLM-based agents: learning what an agent should communicate to a human, and how, from human preferences, in mixed human-agent settings such as autonomous and human-driven vehicles.</w:t>
+      </w:r>
+    </w:p>
+    <w:p>
+      <w:r>
+        <w:rPr>
+          <w:rFonts w:ascii="Calibri" w:eastAsia="Calibri" w:hAnsi="Calibri"/>
+        </w:rPr>
+        <w:t>A related line of work, begun during my postdoc at Carnegie Mellon, studies the people who build AI systems: capturing and modeling the workflows of ML practitioners as they develop machine learning models, and predicting the moments where they get stuck so that tools can offer targeted support.</w:t>
       </w:r>
     </w:p>
     <w:p>

</xml_diff>

<commit_message>
Drop the CV's Research Interests section and lead with Academic Positions
Co-Authored-By: Claude Fable 5.1 <noreply@anthropic.com>
Claude-Session: https://claude.ai/code/session_01P2fsSpp5LJyrgm7ofHkpMm
</commit_message>
<xml_diff>
--- a/cv/Moshe_Mash_CV.docx
+++ b/cv/Moshe_Mash_CV.docx
@@ -73,31 +73,61 @@
           <w:b/>
           <w:bCs/>
         </w:rPr>
-        <w:t>Research Interests</w:t>
-      </w:r>
-    </w:p>
-    <w:p>
-      <w:r>
-        <w:rPr>
-          <w:rFonts w:ascii="Calibri" w:eastAsia="Calibri" w:hAnsi="Calibri"/>
-        </w:rPr>
-        <w:t>My research centers on environments shared by humans and computer agents: how they interact, coordinate, and reach agreements, and how to design agents that act well alongside people. I combine game theory and mechanism design with machine learning to model, predict, and shape behavior in such settings, from joint exploration and negotiation to coalition formation and fair division. I am interested in extending this line to LLM-based agents: learning what an agent should communicate to a human, and how, from human preferences, in mixed human-agent settings such as autonomous and human-driven vehicles.</w:t>
-      </w:r>
-    </w:p>
-    <w:p>
-      <w:r>
-        <w:rPr>
-          <w:rFonts w:ascii="Calibri" w:eastAsia="Calibri" w:hAnsi="Calibri"/>
-        </w:rPr>
-        <w:t>A related line of work, begun during my postdoc at Carnegie Mellon, studies the people who build AI systems: capturing and modeling the workflows of ML practitioners as they develop machine learning models, and predicting the moments where they get stuck so that tools can offer targeted support.</w:t>
-      </w:r>
-    </w:p>
-    <w:p>
-      <w:r>
-        <w:rPr>
-          <w:rFonts w:ascii="Calibri" w:eastAsia="Calibri" w:hAnsi="Calibri"/>
-        </w:rPr>
-        <w:t>A third, applied strand of my research uses large language models and modern NLP for text analysis in specialized domains: authorship attribution, automatic citation generation, and semantic cross-referencing of Hebrew and rabbinic texts (with DICTA), and computational analysis of legal and patent text, including textual studies of disparate outcomes in the patent system. Both involve fine-tuning LLMs for prediction, clustering, and semantic analysis of domain-specific corpora.</w:t>
+        <w:t>Academic Positions</w:t>
+      </w:r>
+    </w:p>
+    <w:p>
+      <w:r>
+        <w:rPr>
+          <w:rFonts w:ascii="Calibri" w:eastAsia="Calibri" w:hAnsi="Calibri"/>
+          <w:b/>
+          <w:bCs/>
+        </w:rPr>
+        <w:t>Postdoctoral Researcher</w:t>
+      </w:r>
+      <w:r>
+        <w:rPr>
+          <w:rFonts w:ascii="Calibri" w:eastAsia="Calibri" w:hAnsi="Calibri"/>
+        </w:rPr>
+        <w:t xml:space="preserve"> | </w:t>
+      </w:r>
+      <w:r>
+        <w:rPr>
+          <w:rFonts w:ascii="Calibri" w:eastAsia="Calibri" w:hAnsi="Calibri"/>
+          <w:b/>
+          <w:bCs/>
+        </w:rPr>
+        <w:t>Carnegie Mellon University, Robotics Institute</w:t>
+      </w:r>
+      <w:r>
+        <w:rPr>
+          <w:rFonts w:ascii="Calibri" w:eastAsia="Calibri" w:hAnsi="Calibri"/>
+        </w:rPr>
+        <w:t xml:space="preserve"> | </w:t>
+      </w:r>
+      <w:r>
+        <w:rPr>
+          <w:rFonts w:ascii="Calibri" w:eastAsia="Calibri" w:hAnsi="Calibri"/>
+          <w:b/>
+          <w:bCs/>
+        </w:rPr>
+        <w:t>2019–2022</w:t>
+      </w:r>
+    </w:p>
+    <w:p>
+      <w:r>
+        <w:rPr>
+          <w:rFonts w:ascii="Calibri" w:eastAsia="Calibri" w:hAnsi="Calibri"/>
+        </w:rPr>
+        <w:t>Hosted by Prof. Reid Simmons and Dr. Stephanie Rosenthal. My research studied the people who build AI systems: how machine learning practitioners and data scientists work as they develop models, and where they get stuck. I developed DSWorkFlow, a framework that captures data scientists' workflows from Jupyter notebooks, reconstructs the order in which code was executed, and combines it with qualitative data, and used it in studies of data scientists building machine learning models (CHI). Building on that data, I developed a model that predicts stuckness from real-time indicators such as code artifacts, and an algorithm that times an intervention as close as possible to the onset of stuckness (VL/HCC).</w:t>
+      </w:r>
+    </w:p>
+    <w:p>
+      <w:r>
+        <w:rPr>
+          <w:rFonts w:ascii="Calibri" w:eastAsia="Calibri" w:hAnsi="Calibri"/>
+        </w:rPr>
+        <w:t>I mentored students in AI and human-computer interaction research. The research was funded by J.P. Morgan, which renewed the award for a second consecutive year based on the project's results.</w:t>
       </w:r>
     </w:p>
     <w:p>
@@ -476,86 +506,6 @@
         </w:rPr>
         <w:pict w14:anchorId="50DDD9F5">
           <v:rect id="_x0000_i1026" style="width:0;height:1.5pt" o:hralign="center" o:hrstd="t" o:hrnoshade="t" o:hr="t" fillcolor="gray" stroked="f"/>
-        </w:pict>
-      </w:r>
-    </w:p>
-    <w:p>
-      <w:pPr>
-        <w:rPr>
-          <w:b/>
-          <w:bCs/>
-        </w:rPr>
-      </w:pPr>
-      <w:r>
-        <w:rPr>
-          <w:rFonts w:ascii="Calibri" w:eastAsia="Calibri" w:hAnsi="Calibri"/>
-          <w:b/>
-          <w:bCs/>
-        </w:rPr>
-        <w:t>Academic Positions</w:t>
-      </w:r>
-    </w:p>
-    <w:p>
-      <w:r>
-        <w:rPr>
-          <w:rFonts w:ascii="Calibri" w:eastAsia="Calibri" w:hAnsi="Calibri"/>
-          <w:b/>
-          <w:bCs/>
-        </w:rPr>
-        <w:t>Postdoctoral Researcher</w:t>
-      </w:r>
-      <w:r>
-        <w:rPr>
-          <w:rFonts w:ascii="Calibri" w:eastAsia="Calibri" w:hAnsi="Calibri"/>
-        </w:rPr>
-        <w:t xml:space="preserve"> | </w:t>
-      </w:r>
-      <w:r>
-        <w:rPr>
-          <w:rFonts w:ascii="Calibri" w:eastAsia="Calibri" w:hAnsi="Calibri"/>
-          <w:b/>
-          <w:bCs/>
-        </w:rPr>
-        <w:t>Carnegie Mellon University, Robotics Institute</w:t>
-      </w:r>
-      <w:r>
-        <w:rPr>
-          <w:rFonts w:ascii="Calibri" w:eastAsia="Calibri" w:hAnsi="Calibri"/>
-        </w:rPr>
-        <w:t xml:space="preserve"> | </w:t>
-      </w:r>
-      <w:r>
-        <w:rPr>
-          <w:rFonts w:ascii="Calibri" w:eastAsia="Calibri" w:hAnsi="Calibri"/>
-          <w:b/>
-          <w:bCs/>
-        </w:rPr>
-        <w:t>2019–2022</w:t>
-      </w:r>
-    </w:p>
-    <w:p>
-      <w:r>
-        <w:rPr>
-          <w:rFonts w:ascii="Calibri" w:eastAsia="Calibri" w:hAnsi="Calibri"/>
-        </w:rPr>
-        <w:t>Hosted by Prof. Reid Simmons and Dr. Stephanie Rosenthal. My research studied the people who build AI systems: how machine learning practitioners and data scientists work as they develop models, and where they get stuck. I developed DSWorkFlow, a framework that captures data scientists' workflows from Jupyter notebooks, reconstructs the order in which code was executed, and combines it with qualitative data, and used it in studies of data scientists building machine learning models (CHI). Building on that data, I developed a model that predicts stuckness from real-time indicators such as code artifacts, and an algorithm that times an intervention as close as possible to the onset of stuckness (VL/HCC).</w:t>
-      </w:r>
-    </w:p>
-    <w:p>
-      <w:r>
-        <w:rPr>
-          <w:rFonts w:ascii="Calibri" w:eastAsia="Calibri" w:hAnsi="Calibri"/>
-        </w:rPr>
-        <w:t>I mentored students in AI and human-computer interaction research. The research was funded by J.P. Morgan, which renewed the award for a second consecutive year based on the project's results.</w:t>
-      </w:r>
-    </w:p>
-    <w:p>
-      <w:r>
-        <w:rPr>
-          <w:rFonts w:ascii="Calibri" w:eastAsia="Calibri" w:hAnsi="Calibri"/>
-        </w:rPr>
-        <w:pict w14:anchorId="69FF5FEC">
-          <v:rect id="_x0000_i1027" style="width:0;height:1.5pt" o:hralign="center" o:hrstd="t" o:hrnoshade="t" o:hr="t" fillcolor="gray" stroked="f"/>
         </w:pict>
       </w:r>
     </w:p>

</xml_diff>

<commit_message>
List the postdoc hosts as a labeled line like the Ph.D. advisor
Co-Authored-By: Claude Fable 5.1 <noreply@anthropic.com>
Claude-Session: https://claude.ai/code/session_01P2fsSpp5LJyrgm7ofHkpMm
</commit_message>
<xml_diff>
--- a/cv/Moshe_Mash_CV.docx
+++ b/cv/Moshe_Mash_CV.docx
@@ -115,11 +115,33 @@
       </w:r>
     </w:p>
     <w:p>
-      <w:r>
-        <w:rPr>
-          <w:rFonts w:ascii="Calibri" w:eastAsia="Calibri" w:hAnsi="Calibri"/>
-        </w:rPr>
-        <w:t>Hosted by Prof. Reid Simmons and Dr. Stephanie Rosenthal. My research studied the people who build AI systems: how machine learning practitioners and data scientists work as they develop models, and where they get stuck. I developed DSWorkFlow, a framework that captures data scientists' workflows from Jupyter notebooks, reconstructs the order in which code was executed, and combines it with qualitative data, and used it in studies of data scientists building machine learning models (CHI). Building on that data, I developed a model that predicts stuckness from real-time indicators such as code artifacts, and an algorithm that times an intervention as close as possible to the onset of stuckness (VL/HCC).</w:t>
+      <w:pPr>
+        <w:numPr>
+          <w:ilvl w:val="0"/>
+          <w:numId w:val="19"/>
+        </w:numPr>
+      </w:pPr>
+      <w:r>
+        <w:rPr>
+          <w:rFonts w:ascii="Calibri" w:eastAsia="Calibri" w:hAnsi="Calibri"/>
+          <w:b/>
+          <w:bCs/>
+        </w:rPr>
+        <w:t xml:space="preserve">Hosts: </w:t>
+      </w:r>
+      <w:r>
+        <w:rPr>
+          <w:rFonts w:ascii="Calibri" w:eastAsia="Calibri" w:hAnsi="Calibri"/>
+        </w:rPr>
+        <w:t>Prof. Reid Simmons and Dr. Stephanie Rosenthal</w:t>
+      </w:r>
+    </w:p>
+    <w:p>
+      <w:r>
+        <w:rPr>
+          <w:rFonts w:ascii="Calibri" w:eastAsia="Calibri" w:hAnsi="Calibri"/>
+        </w:rPr>
+        <w:t>My research studied the people who build AI systems: how machine learning practitioners and data scientists work as they develop models, and where they get stuck. I developed DSWorkFlow, a framework that captures data scientists' workflows from Jupyter notebooks, reconstructs the order in which code was executed, and combines it with qualitative data, and used it in studies of data scientists building machine learning models (CHI). Building on that data, I developed a model that predicts stuckness from real-time indicators such as code artifacts, and an algorithm that times an intervention as close as possible to the onset of stuckness (VL/HCC).</w:t>
       </w:r>
     </w:p>
     <w:p>

</xml_diff>

<commit_message>
Describe the DICTA role in prose with example projects as bullets
Co-Authored-By: Claude Fable 5.1 <noreply@anthropic.com>
Claude-Session: https://claude.ai/code/session_01P2fsSpp5LJyrgm7ofHkpMm
</commit_message>
<xml_diff>
--- a/cv/Moshe_Mash_CV.docx
+++ b/cv/Moshe_Mash_CV.docx
@@ -600,6 +600,24 @@
       </w:r>
     </w:p>
     <w:p>
+      <w:r>
+        <w:rPr>
+          <w:rFonts w:ascii="Calibri" w:eastAsia="Calibri" w:hAnsi="Calibri"/>
+          <w:b w:val="0"/>
+        </w:rPr>
+        <w:t>I lead the center's NLP and LLM research on large collections of Hebrew and rabbinic texts: setting the research agenda, designing the methods, and taking systems from prototype to tools in active use by scholars. The work combines fine-tuned LLMs and custom text embeddings trained with contrastive learning for domain-specific corpora, powering information extraction, semantic search, text similarity, clustering, and question answering over long, complex documents, together with deep-learning models for morphological, syntactic, and semantic analysis of long documents at scale. I built the end-to-end training and inference pipeline, with tooling to analyze model outcomes and inspect the training process, and deployed the resulting document-understanding systems to production.</w:t>
+      </w:r>
+    </w:p>
+    <w:p>
+      <w:r>
+        <w:rPr>
+          <w:rFonts w:ascii="Calibri" w:eastAsia="Calibri" w:hAnsi="Calibri"/>
+          <w:b/>
+        </w:rPr>
+        <w:t>Example projects:</w:t>
+      </w:r>
+    </w:p>
+    <w:p>
       <w:pPr>
         <w:numPr>
           <w:ilvl w:val="0"/>
@@ -610,7 +628,7 @@
         <w:rPr>
           <w:rFonts w:ascii="Calibri" w:eastAsia="Calibri" w:hAnsi="Calibri"/>
         </w:rPr>
-        <w:t>Lead the center's NLP and LLM research on large collections of Hebrew and rabbinic texts: set the research agenda, design the methods, and take systems from prototype to tools in active use by scholars.</w:t>
+        <w:t>Authorship attribution: built models that predict the author of texts with historically disputed attribution from textual signals alone, reaching high accuracy and resolving long-debated questions of authorship.</w:t>
       </w:r>
     </w:p>
     <w:p>
@@ -624,63 +642,7 @@
         <w:rPr>
           <w:rFonts w:ascii="Calibri" w:eastAsia="Calibri" w:hAnsi="Calibri"/>
         </w:rPr>
-        <w:t>Authorship attribution: built models that predict the author of texts with historically disputed attribution from textual signals alone, reaching high accuracy and resolving long-debated questions of authorship.</w:t>
-      </w:r>
-    </w:p>
-    <w:p>
-      <w:pPr>
-        <w:numPr>
-          <w:ilvl w:val="0"/>
-          <w:numId w:val="21"/>
-        </w:numPr>
-      </w:pPr>
-      <w:r>
-        <w:rPr>
-          <w:rFonts w:ascii="Calibri" w:eastAsia="Calibri" w:hAnsi="Calibri"/>
-        </w:rPr>
         <w:t>Citation detection and cross-referencing: designed systems that automatically detect, extract, and link citations of classical sources across a large corpus, connecting documents that quote or paraphrase one another.</w:t>
-      </w:r>
-    </w:p>
-    <w:p>
-      <w:pPr>
-        <w:numPr>
-          <w:ilvl w:val="0"/>
-          <w:numId w:val="21"/>
-        </w:numPr>
-      </w:pPr>
-      <w:r>
-        <w:rPr>
-          <w:rFonts w:ascii="Calibri" w:eastAsia="Calibri" w:hAnsi="Calibri"/>
-        </w:rPr>
-        <w:t>Document understanding with LLMs: fine-tuned LLMs and trained custom text embeddings with contrastive learning for domain-specific corpora, powering information extraction, semantic search, text similarity, clustering, and question answering over long, complex documents.</w:t>
-      </w:r>
-    </w:p>
-    <w:p>
-      <w:pPr>
-        <w:numPr>
-          <w:ilvl w:val="0"/>
-          <w:numId w:val="21"/>
-        </w:numPr>
-      </w:pPr>
-      <w:r>
-        <w:rPr>
-          <w:rFonts w:ascii="Calibri" w:eastAsia="Calibri" w:hAnsi="Calibri"/>
-        </w:rPr>
-        <w:t>Linguistic analysis: built deep-learning models for morphological, syntactic, and semantic analysis of long, complex documents at scale.</w:t>
-      </w:r>
-    </w:p>
-    <w:p>
-      <w:pPr>
-        <w:numPr>
-          <w:ilvl w:val="0"/>
-          <w:numId w:val="21"/>
-        </w:numPr>
-      </w:pPr>
-      <w:r>
-        <w:rPr>
-          <w:rFonts w:ascii="Calibri" w:eastAsia="Calibri" w:hAnsi="Calibri"/>
-        </w:rPr>
-        <w:t>Infrastructure and deployment: built the end-to-end training and inference pipeline, with tooling to analyze model outcomes and inspect the training process, and deployed the resulting document-understanding systems to production.</w:t>
       </w:r>
     </w:p>
     <w:p>

</xml_diff>

<commit_message>
Add a Google Scholar link to the site and the CV contact line
Co-Authored-By: Claude Fable 5.1 <noreply@anthropic.com>
Claude-Session: https://claude.ai/code/session_01P2fsSpp5LJyrgm7ofHkpMm
</commit_message>
<xml_diff>
--- a/cv/Moshe_Mash_CV.docx
+++ b/cv/Moshe_Mash_CV.docx
@@ -47,6 +47,21 @@
             <w:u w:val="single"/>
           </w:rPr>
           <w:t>linkedin.com/in/moshemash</w:t>
+        </w:r>
+      </w:hyperlink>
+      <w:r>
+        <w:rPr>
+          <w:rFonts w:ascii="Calibri" w:hAnsi="Calibri"/>
+        </w:rPr>
+        <w:t xml:space="preserve"> | </w:t>
+      </w:r>
+      <w:hyperlink r:id="rId11">
+        <w:r>
+          <w:rPr>
+            <w:color w:val="0563C1"/>
+            <w:u w:val="single"/>
+          </w:rPr>
+          <w:t>Google Scholar</w:t>
         </w:r>
       </w:hyperlink>
     </w:p>

</xml_diff>

<commit_message>
Note presentations to senior leadership in the Amdocs entry
Co-Authored-By: Claude Fable 5.1 <noreply@anthropic.com>
Claude-Session: https://claude.ai/code/session_01P2fsSpp5LJyrgm7ofHkpMm
</commit_message>
<xml_diff>
--- a/cv/Moshe_Mash_CV.docx
+++ b/cv/Moshe_Mash_CV.docx
@@ -790,6 +790,20 @@
           <w:rFonts w:ascii="Calibri" w:eastAsia="Calibri" w:hAnsi="Calibri"/>
         </w:rPr>
         <w:t>Designed, built, and deployed the system from scratch, including problem definition, algorithm design, evaluation, and deployment pipeline.</w:t>
+      </w:r>
+    </w:p>
+    <w:p>
+      <w:pPr>
+        <w:numPr>
+          <w:ilvl w:val="0"/>
+          <w:numId w:val="25"/>
+        </w:numPr>
+      </w:pPr>
+      <w:r>
+        <w:rPr>
+          <w:rFonts w:ascii="Calibri" w:eastAsia="Calibri" w:hAnsi="Calibri"/>
+        </w:rPr>
+        <w:t>Presented the system and its business results to senior leadership at the company.</w:t>
       </w:r>
     </w:p>
     <w:p>

</xml_diff>

<commit_message>
Use short venue names with years in the research paragraphs
Co-Authored-By: Claude Fable 5.1 <noreply@anthropic.com>
Claude-Session: https://claude.ai/code/session_01P2fsSpp5LJyrgm7ofHkpMm
</commit_message>
<xml_diff>
--- a/cv/Moshe_Mash_CV.docx
+++ b/cv/Moshe_Mash_CV.docx
@@ -156,7 +156,7 @@
         <w:rPr>
           <w:rFonts w:ascii="Calibri" w:eastAsia="Calibri" w:hAnsi="Calibri"/>
         </w:rPr>
-        <w:t>My research studied the people who build AI systems: how machine learning practitioners and data scientists work as they develop models, and where they get stuck. I developed DSWorkFlow, a framework that captures data scientists' workflows from Jupyter notebooks, reconstructs the order in which code was executed, and combines it with qualitative data, and used it in studies of data scientists building machine learning models (CHI). Building on that data, I developed a model that predicts stuckness from real-time indicators such as code artifacts, and an algorithm that times an intervention as close as possible to the onset of stuckness (VL/HCC).</w:t>
+        <w:t>My research studied the people who build AI systems: how machine learning practitioners and data scientists work as they develop models, and where they get stuck. I developed DSWorkFlow, a framework that captures data scientists' workflows from Jupyter notebooks, reconstructs the order in which code was executed, and combines it with qualitative data, and used it in studies of data scientists building machine learning models (CHI 2021). Building on that data, I developed a model that predicts stuckness from real-time indicators such as code artifacts, and an algorithm that times an intervention as close as possible to the onset of stuckness (VL/HCC 2022).</w:t>
       </w:r>
     </w:p>
     <w:p>
@@ -280,7 +280,7 @@
         <w:rPr>
           <w:rFonts w:ascii="Calibri" w:eastAsia="Calibri" w:hAnsi="Calibri"/>
         </w:rPr>
-        <w:t>Dissertation research on how people and computer agents reach fair agreements in group settings. One line of work addressed the classic rent division problem: assigning rooms to housemates and splitting the rent fairly. We developed a polynomial-time algorithmic framework for computing envy-free solutions that optimize a chosen fairness criterion, and proved that the maximin solution, which maximizes the minimum utility subject to envy-freeness, is also equitable, minimizing the disparity between players. We established this theoretically, empirically on real data from the Spliddit website, and in a user study with Spliddit users, and the solution has been deployed on Spliddit since 2015 (ACM EC 2016 Best Paper Award; JACM; Communications of the ACM Research Highlight). A second line studied coalition formation in weighted voting games, combining cooperative game theory with machine learning to predict how people form coalitions, and designing an agent that negotiates with people and outperformed human players (IJCAI 2017; ACM TIST). Mentored master's students and advised final-year projects throughout the Ph.D.</w:t>
+        <w:t>Dissertation research on how people and computer agents reach fair agreements in group settings. One line of work addressed the classic rent division problem: assigning rooms to housemates and splitting the rent fairly. We developed a polynomial-time algorithmic framework for computing envy-free solutions that optimize a chosen fairness criterion, and proved that the maximin solution, which maximizes the minimum utility subject to envy-freeness, is also equitable, minimizing the disparity between players. We established this theoretically, empirically on real data from the Spliddit website, and in a user study with Spliddit users, and the solution has been deployed on Spliddit since 2015 (Best Paper Award, ACM EC 2016; JACM 2017; CACM Research Highlight 2018). A second line studied coalition formation in weighted voting games, combining cooperative game theory with machine learning to predict how people form coalitions, and designing an agent that negotiates with people and outperformed human players (IJCAI 2017; ACM TIST 2020). Mentored master's students and advised final-year projects throughout the Ph.D.</w:t>
       </w:r>
     </w:p>
     <w:p>
@@ -370,7 +370,7 @@
         <w:rPr>
           <w:rFonts w:ascii="Calibri" w:eastAsia="Calibri" w:hAnsi="Calibri"/>
         </w:rPr>
-        <w:t>Thesis research on joint exploration by self-interested agents: settings in which several agents search for opportunities whose values are uncertain and costly to reveal, and share what they find. Using equilibrium analysis, the work showed that mechanisms intended to enhance cooperation, such as longer search horizons or more cooperating agents, can degrade individual and overall utility when agents are self-interested, with implications for the design of multi-agent markets and systems (Artificial Intelligence Journal; IAT 2012).</w:t>
+        <w:t>Thesis research on joint exploration by self-interested agents: settings in which several agents search for opportunities whose values are uncertain and costly to reveal, and share what they find. Using equilibrium analysis, the work showed that mechanisms intended to enhance cooperation, such as longer search horizons or more cooperating agents, can degrade individual and overall utility when agents are self-interested, with implications for the design of multi-agent markets and systems (AIJ 2014; IAT 2012).</w:t>
       </w:r>
     </w:p>
     <w:p>

</xml_diff>

<commit_message>
Add the IJCAI 2017 rent-division entry and cite it in the Ph.D. paragraph
Co-Authored-By: Claude Fable 5.1 <noreply@anthropic.com>
Claude-Session: https://claude.ai/code/session_01P2fsSpp5LJyrgm7ofHkpMm
</commit_message>
<xml_diff>
--- a/cv/Moshe_Mash_CV.docx
+++ b/cv/Moshe_Mash_CV.docx
@@ -280,7 +280,7 @@
         <w:rPr>
           <w:rFonts w:ascii="Calibri" w:eastAsia="Calibri" w:hAnsi="Calibri"/>
         </w:rPr>
-        <w:t>Dissertation research on how people and computer agents reach fair agreements in group settings. One line of work addressed the classic rent division problem: assigning rooms to housemates and splitting the rent fairly. We developed a polynomial-time algorithmic framework for computing envy-free solutions that optimize a chosen fairness criterion, and proved that the maximin solution, which maximizes the minimum utility subject to envy-freeness, is also equitable, minimizing the disparity between players. We established this theoretically, empirically on real data from the Spliddit website, and in a user study with Spliddit users, and the solution has been deployed on Spliddit since 2015 (Best Paper Award, ACM EC 2016; JACM 2017; CACM Research Highlight 2018). A second line studied coalition formation in weighted voting games, combining cooperative game theory with machine learning to predict how people form coalitions, and designing an agent that negotiates with people and outperformed human players (IJCAI 2017; ACM TIST 2020). Mentored master's students and advised final-year projects throughout the Ph.D.</w:t>
+        <w:t>Dissertation research on how people and computer agents reach fair agreements in group settings. One line of work addressed the classic rent division problem: assigning rooms to housemates and splitting the rent fairly. We developed a polynomial-time algorithmic framework for computing envy-free solutions that optimize a chosen fairness criterion, and proved that the maximin solution, which maximizes the minimum utility subject to envy-freeness, is also equitable, minimizing the disparity between players. We established this theoretically, empirically on real data from the Spliddit website, and in a user study with Spliddit users, and the solution has been deployed on Spliddit since 2015 (Best Paper Award, ACM EC 2016; IJCAI 2017; JACM 2017; CACM Research Highlight 2018). A second line studied coalition formation in weighted voting games, combining cooperative game theory with machine learning to predict how people form coalitions, and designing an agent that negotiates with people and outperformed human players (IJCAI 2017; ACM TIST 2020). Mentored master's students and advised final-year projects throughout the Ph.D.</w:t>
       </w:r>
     </w:p>
     <w:p>
@@ -1521,6 +1521,20 @@
           <w:rFonts w:ascii="Calibri" w:eastAsia="Calibri" w:hAnsi="Calibri"/>
         </w:rPr>
         <w:t>Mash, M., Bachrach, Y., Gal, K., &amp; Zick, Y. (2017). How to Form Winning Coalitions in Mixed Human-Computer Settings. IJCAI.</w:t>
+      </w:r>
+    </w:p>
+    <w:p>
+      <w:pPr>
+        <w:numPr>
+          <w:ilvl w:val="0"/>
+          <w:numId w:val="36"/>
+        </w:numPr>
+      </w:pPr>
+      <w:r>
+        <w:rPr>
+          <w:rFonts w:ascii="Calibri" w:eastAsia="Calibri" w:hAnsi="Calibri"/>
+        </w:rPr>
+        <w:t>Gal, K., Mash, M., Procaccia, A., &amp; Zick, Y. (2017). Which Is the Fairest (Rent Division) of Them All? IJCAI. (Best Sister Conferences track, extended abstract)</w:t>
       </w:r>
     </w:p>
     <w:p>

</xml_diff>

<commit_message>
Restore the Publications and CV sections; bold the awards
- Publications list and the CV download section return below the hero,
  with the tab-switching script restored
- The CACM note in the publications list is bold
- The award mentions in the CV's Ph.D. paragraph are bold

Co-Authored-By: Claude Fable 5.1 <noreply@anthropic.com>
Claude-Session: https://claude.ai/code/session_01P2fsSpp5LJyrgm7ofHkpMm
</commit_message>
<xml_diff>
--- a/cv/Moshe_Mash_CV.docx
+++ b/cv/Moshe_Mash_CV.docx
@@ -280,7 +280,33 @@
         <w:rPr>
           <w:rFonts w:ascii="Calibri" w:eastAsia="Calibri" w:hAnsi="Calibri"/>
         </w:rPr>
-        <w:t>Dissertation research on how people and computer agents reach fair agreements in group settings. One line of work addressed the classic rent division problem: assigning rooms to housemates and splitting the rent fairly. We developed a polynomial-time algorithmic framework for computing envy-free solutions that optimize a chosen fairness criterion, and proved that the maximin solution, which maximizes the minimum utility subject to envy-freeness, is also equitable, minimizing the disparity between players. We established this theoretically, empirically on real data from the Spliddit website, and in a user study with Spliddit users, and the solution has been deployed on Spliddit since 2015 (Best Paper Award, ACM EC 2016; IJCAI 2017; JACM 2017; CACM Research Highlight 2018). A second line studied coalition formation in weighted voting games, combining cooperative game theory with machine learning to predict how people form coalitions, and designing an agent that negotiates with people and outperformed human players (IJCAI 2017; ACM TIST 2020). Mentored master's students and advised final-year projects throughout the Ph.D.</w:t>
+        <w:t>Dissertation research on how people and computer agents reach fair agreements in group settings. One line of work addressed the classic rent division problem: assigning rooms to housemates and splitting the rent fairly. We developed a polynomial-time algorithmic framework for computing envy-free solutions that optimize a chosen fairness criterion, and proved that the maximin solution, which maximizes the minimum utility subject to envy-freeness, is also equitable, minimizing the disparity between players. We established this theoretically, empirically on real data from the Spliddit website, and in a user study with Spliddit users, and the solution has been deployed on Spliddit since 2015 (</w:t>
+      </w:r>
+      <w:r>
+        <w:rPr>
+          <w:rFonts w:ascii="Calibri" w:eastAsia="Calibri" w:hAnsi="Calibri"/>
+          <w:b/>
+        </w:rPr>
+        <w:t>Best Paper Award, ACM EC 2016</w:t>
+      </w:r>
+      <w:r>
+        <w:rPr>
+          <w:rFonts w:ascii="Calibri" w:eastAsia="Calibri" w:hAnsi="Calibri"/>
+        </w:rPr>
+        <w:t xml:space="preserve">; IJCAI 2017; JACM 2017; </w:t>
+      </w:r>
+      <w:r>
+        <w:rPr>
+          <w:rFonts w:ascii="Calibri" w:eastAsia="Calibri" w:hAnsi="Calibri"/>
+          <w:b/>
+        </w:rPr>
+        <w:t>CACM Research Highlight 2018</w:t>
+      </w:r>
+      <w:r>
+        <w:rPr>
+          <w:rFonts w:ascii="Calibri" w:eastAsia="Calibri" w:hAnsi="Calibri"/>
+        </w:rPr>
+        <w:t>). A second line studied coalition formation in weighted voting games, combining cooperative game theory with machine learning to predict how people form coalitions, and designing an agent that negotiates with people and outperformed human players (IJCAI 2017; ACM TIST 2020). Mentored master's students and advised final-year projects throughout the Ph.D.</w:t>
       </w:r>
     </w:p>
     <w:p>

</xml_diff>